<commit_message>
BRD v5.2 + TDD v3.2: address Day 3 feedback
BRD fixes:
- Clarified Phase 1 (4 active platforms) vs Phase 2 (3 future) — not scope creep
- Reconciled baseline metric: added note explaining 40 min/week vs earlier 10 min/day estimate
- Aligned AC-03 and NFR-02: both now use 95%/5% variance threshold (were conflicting)
- Fixed assumption: "7 platforms" → "4 active Phase 1 platforms" + correct Firefox profile reference

TDD fixes:
- Added pytest validation evidence reference: 283 passed, commit 6caf2b1, 4.21s
- Added Vision latency risk: 3-4 min per Instagram URL vs 5 min polling SLA (with mitigation)
- Added Claude API cost estimate: ~$0.42/year at current scale (10 videos/week)

Co-Authored-By: Claude Sonnet 4.6 <noreply@anthropic.com>
</commit_message>
<xml_diff>
--- a/TDD_Auto_Count_Social_Media_Reach.docx
+++ b/TDD_Auto_Count_Social_Media_Reach.docx
@@ -96,7 +96,7 @@
               <w:rPr>
                 <w:sz w:val="20"/>
               </w:rPr>
-              <w:t>3.0</w:t>
+              <w:t>3.2</w:t>
             </w:r>
           </w:p>
         </w:tc>
@@ -140,7 +140,7 @@
               <w:rPr>
                 <w:sz w:val="20"/>
               </w:rPr>
-              <w:t>13 May 2026</w:t>
+              <w:t>14 May 2026</w:t>
             </w:r>
           </w:p>
         </w:tc>
@@ -272,7 +272,7 @@
               <w:rPr>
                 <w:sz w:val="20"/>
               </w:rPr>
-              <w:t>BRD v5.0 — Auto Count Social Media Reach</w:t>
+              <w:t>BRD v5.1 — Auto Count Social Media Reach</w:t>
             </w:r>
           </w:p>
         </w:tc>
@@ -648,6 +648,178 @@
                 <w:sz w:val="20"/>
               </w:rPr>
               <w:t>Updated: watcher.py background daemon, yt-dlp for YouTube/TikTok, Firefox for Instagram/RedNote, single atomic Lark write, retry logic, shortcode security validation, startup env check, 283 tests, src/ module layout, structured logging</w:t>
+            </w:r>
+          </w:p>
+        </w:tc>
+      </w:tr>
+      <w:tr>
+        <w:tc>
+          <w:tcPr>
+            <w:tcW w:type="dxa" w:w="2340"/>
+            <w:tcW w:w="1007" w:type="dxa"/>
+            <w:shd w:val="clear" w:color="auto" w:fill="F0F4FF"/>
+            <w:tcBorders>
+              <w:top w:val="single" w:sz="4" w:space="0" w:color="CCCCCC"/>
+              <w:left w:val="single" w:sz="4" w:space="0" w:color="CCCCCC"/>
+              <w:bottom w:val="single" w:sz="4" w:space="0" w:color="CCCCCC"/>
+              <w:right w:val="single" w:sz="4" w:space="0" w:color="CCCCCC"/>
+            </w:tcBorders>
+          </w:tcPr>
+          <w:p>
+            <w:r>
+              <w:rPr>
+                <w:sz w:val="20"/>
+              </w:rPr>
+              <w:t>3.1</w:t>
+            </w:r>
+          </w:p>
+        </w:tc>
+        <w:tc>
+          <w:tcPr>
+            <w:tcW w:type="dxa" w:w="2340"/>
+            <w:tcW w:w="2160" w:type="dxa"/>
+            <w:shd w:val="clear" w:color="auto" w:fill="F0F4FF"/>
+            <w:tcBorders>
+              <w:top w:val="single" w:sz="4" w:space="0" w:color="CCCCCC"/>
+              <w:left w:val="single" w:sz="4" w:space="0" w:color="CCCCCC"/>
+              <w:bottom w:val="single" w:sz="4" w:space="0" w:color="CCCCCC"/>
+              <w:right w:val="single" w:sz="4" w:space="0" w:color="CCCCCC"/>
+            </w:tcBorders>
+          </w:tcPr>
+          <w:p>
+            <w:r>
+              <w:rPr>
+                <w:sz w:val="20"/>
+              </w:rPr>
+              <w:t>13 May 2026</w:t>
+            </w:r>
+          </w:p>
+        </w:tc>
+        <w:tc>
+          <w:tcPr>
+            <w:tcW w:type="dxa" w:w="2340"/>
+            <w:tcW w:w="2160" w:type="dxa"/>
+            <w:shd w:val="clear" w:color="auto" w:fill="F0F4FF"/>
+            <w:tcBorders>
+              <w:top w:val="single" w:sz="4" w:space="0" w:color="CCCCCC"/>
+              <w:left w:val="single" w:sz="4" w:space="0" w:color="CCCCCC"/>
+              <w:bottom w:val="single" w:sz="4" w:space="0" w:color="CCCCCC"/>
+              <w:right w:val="single" w:sz="4" w:space="0" w:color="CCCCCC"/>
+            </w:tcBorders>
+          </w:tcPr>
+          <w:p>
+            <w:r>
+              <w:rPr>
+                <w:sz w:val="20"/>
+              </w:rPr>
+              <w:t>jingyi-rere</w:t>
+            </w:r>
+          </w:p>
+        </w:tc>
+        <w:tc>
+          <w:tcPr>
+            <w:tcW w:type="dxa" w:w="2340"/>
+            <w:tcW w:w="5472" w:type="dxa"/>
+            <w:shd w:val="clear" w:color="auto" w:fill="F0F4FF"/>
+            <w:tcBorders>
+              <w:top w:val="single" w:sz="4" w:space="0" w:color="CCCCCC"/>
+              <w:left w:val="single" w:sz="4" w:space="0" w:color="CCCCCC"/>
+              <w:bottom w:val="single" w:sz="4" w:space="0" w:color="CCCCCC"/>
+              <w:right w:val="single" w:sz="4" w:space="0" w:color="CCCCCC"/>
+            </w:tcBorders>
+          </w:tcPr>
+          <w:p>
+            <w:r>
+              <w:rPr>
+                <w:sz w:val="20"/>
+              </w:rPr>
+              <w:t>Refined: architecture paragraph, step-by-step cohort timeline, tracking plan, risks and fallbacks per boss requirements</w:t>
+            </w:r>
+          </w:p>
+        </w:tc>
+      </w:tr>
+      <w:tr>
+        <w:tc>
+          <w:tcPr>
+            <w:tcW w:type="dxa" w:w="2340"/>
+            <w:tcW w:w="1007" w:type="dxa"/>
+            <w:shd w:val="clear" w:color="auto" w:fill="FFFFFF"/>
+            <w:tcBorders>
+              <w:top w:val="single" w:sz="4" w:space="0" w:color="CCCCCC"/>
+              <w:left w:val="single" w:sz="4" w:space="0" w:color="CCCCCC"/>
+              <w:bottom w:val="single" w:sz="4" w:space="0" w:color="CCCCCC"/>
+              <w:right w:val="single" w:sz="4" w:space="0" w:color="CCCCCC"/>
+            </w:tcBorders>
+          </w:tcPr>
+          <w:p>
+            <w:r>
+              <w:rPr>
+                <w:sz w:val="20"/>
+              </w:rPr>
+              <w:t>3.2</w:t>
+            </w:r>
+          </w:p>
+        </w:tc>
+        <w:tc>
+          <w:tcPr>
+            <w:tcW w:type="dxa" w:w="2340"/>
+            <w:tcW w:w="2160" w:type="dxa"/>
+            <w:shd w:val="clear" w:color="auto" w:fill="FFFFFF"/>
+            <w:tcBorders>
+              <w:top w:val="single" w:sz="4" w:space="0" w:color="CCCCCC"/>
+              <w:left w:val="single" w:sz="4" w:space="0" w:color="CCCCCC"/>
+              <w:bottom w:val="single" w:sz="4" w:space="0" w:color="CCCCCC"/>
+              <w:right w:val="single" w:sz="4" w:space="0" w:color="CCCCCC"/>
+            </w:tcBorders>
+          </w:tcPr>
+          <w:p>
+            <w:r>
+              <w:rPr>
+                <w:sz w:val="20"/>
+              </w:rPr>
+              <w:t>14 May 2026</w:t>
+            </w:r>
+          </w:p>
+        </w:tc>
+        <w:tc>
+          <w:tcPr>
+            <w:tcW w:type="dxa" w:w="2340"/>
+            <w:tcW w:w="2160" w:type="dxa"/>
+            <w:shd w:val="clear" w:color="auto" w:fill="FFFFFF"/>
+            <w:tcBorders>
+              <w:top w:val="single" w:sz="4" w:space="0" w:color="CCCCCC"/>
+              <w:left w:val="single" w:sz="4" w:space="0" w:color="CCCCCC"/>
+              <w:bottom w:val="single" w:sz="4" w:space="0" w:color="CCCCCC"/>
+              <w:right w:val="single" w:sz="4" w:space="0" w:color="CCCCCC"/>
+            </w:tcBorders>
+          </w:tcPr>
+          <w:p>
+            <w:r>
+              <w:rPr>
+                <w:sz w:val="20"/>
+              </w:rPr>
+              <w:t>jingyi-rere</w:t>
+            </w:r>
+          </w:p>
+        </w:tc>
+        <w:tc>
+          <w:tcPr>
+            <w:tcW w:type="dxa" w:w="2340"/>
+            <w:tcW w:w="5472" w:type="dxa"/>
+            <w:shd w:val="clear" w:color="auto" w:fill="FFFFFF"/>
+            <w:tcBorders>
+              <w:top w:val="single" w:sz="4" w:space="0" w:color="CCCCCC"/>
+              <w:left w:val="single" w:sz="4" w:space="0" w:color="CCCCCC"/>
+              <w:bottom w:val="single" w:sz="4" w:space="0" w:color="CCCCCC"/>
+              <w:right w:val="single" w:sz="4" w:space="0" w:color="CCCCCC"/>
+            </w:tcBorders>
+          </w:tcPr>
+          <w:p>
+            <w:r>
+              <w:rPr>
+                <w:sz w:val="20"/>
+              </w:rPr>
+              <w:t>Feedback fixes: added pytest validation evidence reference (283 passed, commit 6caf2b1), added Vision latency note to timing risk, added Claude API cost estimate to risks table</w:t>
             </w:r>
           </w:p>
         </w:tc>
@@ -678,6 +850,2358 @@
         <w:t>The Auto Count Social Media Reach system is a Python-based automation tool. The user pastes video URLs into Column F of their Lark Bitable, then runs python watcher.py once. The watcher checks Lark every 5 minutes for new URLs and processes them automatically. Each URL is routed to the best extraction method: yt-dlp (fast, exact numbers, no browser) for YouTube and TikTok; Firefox + Claude Haiku Vision (claude-haiku-4-5) for Instagram and RedNote. Instagram uses a two-screenshot approach: reel page for caption and date, profile grid for view count. All extracted data is written to columns A, D, E, G in a single atomic Lark API call. A hard allowlist in lark_writer.py ensures no other columns can ever be written to. All activity is logged to logs/auto_count.log. Errors are displayed in plain English.</w:t>
       </w:r>
     </w:p>
+    <w:p/>
+    <w:p>
+      <w:pPr>
+        <w:pStyle w:val="Heading1"/>
+      </w:pPr>
+      <w:r>
+        <w:t>1.0 Architecture &amp; Approach</w:t>
+      </w:r>
+    </w:p>
+    <w:p>
+      <w:pPr/>
+      <w:r>
+        <w:rPr>
+          <w:b w:val="0"/>
+          <w:i w:val="0"/>
+          <w:sz w:val="22"/>
+        </w:rPr>
+        <w:t>The system uses a two-track extraction pipeline controlled by a background watcher daemon. Track 1 (YouTube, TikTok): each URL is passed to yt-dlp, a battle-tested open-source tool that retrieves exact metadata (title, upload date, view count) directly from platform infrastructure without launching a browser — this takes under 10 seconds per video. Track 2 (Instagram, RedNote): a persistent Firefox browser context (Playwright) loads the real page using the saved login session, dismisses popups, and takes a screenshot; for Instagram specifically, two screenshots are taken — the individual reel page for caption and date, and the profile reels grid for view count (which is only visible there on desktop). Each screenshot is compressed to under 4.5MB if needed, then sent to Claude Haiku Vision (claude-haiku-4-5 via the Anthropic API) with a structured prompt; Claude returns a JSON object containing posted_date, caption, and view_count. The watcher.py daemon polls Lark Bitable every 5 minutes, routes each new URL through the correct track, merges the results, strips all hashtags using Unicode-aware regex, and writes all four fields to Lark columns A, D, E, G in a single atomic API call with automatic retry (up to 3 attempts, 2s/4s/8s back-off). The entire pipeline is observable via a rotating log file (logs/auto_count.log) and protected by 283 automated tests that cover positive, negative, security, performance, UI/UX, and stress scenarios.</w:t>
+      </w:r>
+    </w:p>
+    <w:p/>
+    <w:p>
+      <w:pPr>
+        <w:pStyle w:val="Heading1"/>
+      </w:pPr>
+      <w:r>
+        <w:t>1.1 Step-by-Step Path to Done (Cohort Timeline)</w:t>
+      </w:r>
+    </w:p>
+    <w:p>
+      <w:pPr/>
+      <w:r>
+        <w:rPr>
+          <w:b w:val="0"/>
+          <w:i w:val="0"/>
+          <w:sz w:val="22"/>
+        </w:rPr>
+        <w:t>All core development is complete. The remaining cohort sessions focus on validation, documentation, and demonstration. Each step below has a clear deliverable and a done condition.</w:t>
+      </w:r>
+    </w:p>
+    <w:p/>
+    <w:tbl>
+      <w:tblPr>
+        <w:tblW w:type="auto" w:w="0"/>
+        <w:jc w:val="left"/>
+        <w:tblLook w:firstColumn="1" w:firstRow="1" w:lastColumn="0" w:lastRow="0" w:noHBand="0" w:noVBand="1" w:val="04A0"/>
+      </w:tblPr>
+      <w:tblGrid>
+        <w:gridCol w:w="2340"/>
+        <w:gridCol w:w="2340"/>
+        <w:gridCol w:w="2340"/>
+        <w:gridCol w:w="2340"/>
+      </w:tblGrid>
+      <w:tr>
+        <w:tc>
+          <w:tcPr>
+            <w:tcW w:type="dxa" w:w="2340"/>
+            <w:tcW w:w="1728" w:type="dxa"/>
+            <w:shd w:val="clear" w:color="auto" w:fill="1F497D"/>
+            <w:tcBorders>
+              <w:top w:val="single" w:sz="4" w:space="0" w:color="1F497D"/>
+              <w:left w:val="single" w:sz="4" w:space="0" w:color="1F497D"/>
+              <w:bottom w:val="single" w:sz="4" w:space="0" w:color="1F497D"/>
+              <w:right w:val="single" w:sz="4" w:space="0" w:color="1F497D"/>
+            </w:tcBorders>
+          </w:tcPr>
+          <w:p>
+            <w:r>
+              <w:rPr>
+                <w:b/>
+                <w:color w:val="FFFFFF"/>
+                <w:sz w:val="20"/>
+              </w:rPr>
+              <w:t>Phase</w:t>
+            </w:r>
+          </w:p>
+        </w:tc>
+        <w:tc>
+          <w:tcPr>
+            <w:tcW w:type="dxa" w:w="2340"/>
+            <w:tcW w:w="1440" w:type="dxa"/>
+            <w:shd w:val="clear" w:color="auto" w:fill="1F497D"/>
+            <w:tcBorders>
+              <w:top w:val="single" w:sz="4" w:space="0" w:color="1F497D"/>
+              <w:left w:val="single" w:sz="4" w:space="0" w:color="1F497D"/>
+              <w:bottom w:val="single" w:sz="4" w:space="0" w:color="1F497D"/>
+              <w:right w:val="single" w:sz="4" w:space="0" w:color="1F497D"/>
+            </w:tcBorders>
+          </w:tcPr>
+          <w:p>
+            <w:r>
+              <w:rPr>
+                <w:b/>
+                <w:color w:val="FFFFFF"/>
+                <w:sz w:val="20"/>
+              </w:rPr>
+              <w:t>Status</w:t>
+            </w:r>
+          </w:p>
+        </w:tc>
+        <w:tc>
+          <w:tcPr>
+            <w:tcW w:type="dxa" w:w="2340"/>
+            <w:tcW w:w="4752" w:type="dxa"/>
+            <w:shd w:val="clear" w:color="auto" w:fill="1F497D"/>
+            <w:tcBorders>
+              <w:top w:val="single" w:sz="4" w:space="0" w:color="1F497D"/>
+              <w:left w:val="single" w:sz="4" w:space="0" w:color="1F497D"/>
+              <w:bottom w:val="single" w:sz="4" w:space="0" w:color="1F497D"/>
+              <w:right w:val="single" w:sz="4" w:space="0" w:color="1F497D"/>
+            </w:tcBorders>
+          </w:tcPr>
+          <w:p>
+            <w:r>
+              <w:rPr>
+                <w:b/>
+                <w:color w:val="FFFFFF"/>
+                <w:sz w:val="20"/>
+              </w:rPr>
+              <w:t>What Was / Will Be Done</w:t>
+            </w:r>
+          </w:p>
+        </w:tc>
+        <w:tc>
+          <w:tcPr>
+            <w:tcW w:type="dxa" w:w="2340"/>
+            <w:tcW w:w="2880" w:type="dxa"/>
+            <w:shd w:val="clear" w:color="auto" w:fill="1F497D"/>
+            <w:tcBorders>
+              <w:top w:val="single" w:sz="4" w:space="0" w:color="1F497D"/>
+              <w:left w:val="single" w:sz="4" w:space="0" w:color="1F497D"/>
+              <w:bottom w:val="single" w:sz="4" w:space="0" w:color="1F497D"/>
+              <w:right w:val="single" w:sz="4" w:space="0" w:color="1F497D"/>
+            </w:tcBorders>
+          </w:tcPr>
+          <w:p>
+            <w:r>
+              <w:rPr>
+                <w:b/>
+                <w:color w:val="FFFFFF"/>
+                <w:sz w:val="20"/>
+              </w:rPr>
+              <w:t>Done Condition</w:t>
+            </w:r>
+          </w:p>
+        </w:tc>
+      </w:tr>
+      <w:tr>
+        <w:tc>
+          <w:tcPr>
+            <w:tcW w:type="dxa" w:w="2340"/>
+            <w:tcW w:w="1728" w:type="dxa"/>
+            <w:shd w:val="clear" w:color="auto" w:fill="FFFFFF"/>
+            <w:tcBorders>
+              <w:top w:val="single" w:sz="4" w:space="0" w:color="CCCCCC"/>
+              <w:left w:val="single" w:sz="4" w:space="0" w:color="CCCCCC"/>
+              <w:bottom w:val="single" w:sz="4" w:space="0" w:color="CCCCCC"/>
+              <w:right w:val="single" w:sz="4" w:space="0" w:color="CCCCCC"/>
+            </w:tcBorders>
+          </w:tcPr>
+          <w:p>
+            <w:r>
+              <w:rPr>
+                <w:sz w:val="20"/>
+              </w:rPr>
+              <w:t>Phase 1</w:t>
+              <w:br/>
+              <w:t>Core Pipeline</w:t>
+            </w:r>
+          </w:p>
+        </w:tc>
+        <w:tc>
+          <w:tcPr>
+            <w:tcW w:type="dxa" w:w="2340"/>
+            <w:tcW w:w="1440" w:type="dxa"/>
+            <w:shd w:val="clear" w:color="auto" w:fill="FFFFFF"/>
+            <w:tcBorders>
+              <w:top w:val="single" w:sz="4" w:space="0" w:color="CCCCCC"/>
+              <w:left w:val="single" w:sz="4" w:space="0" w:color="CCCCCC"/>
+              <w:bottom w:val="single" w:sz="4" w:space="0" w:color="CCCCCC"/>
+              <w:right w:val="single" w:sz="4" w:space="0" w:color="CCCCCC"/>
+            </w:tcBorders>
+          </w:tcPr>
+          <w:p>
+            <w:r>
+              <w:rPr>
+                <w:b/>
+                <w:color w:val="007000"/>
+                <w:sz w:val="20"/>
+              </w:rPr>
+              <w:t>DONE</w:t>
+            </w:r>
+          </w:p>
+        </w:tc>
+        <w:tc>
+          <w:tcPr>
+            <w:tcW w:type="dxa" w:w="2340"/>
+            <w:tcW w:w="4752" w:type="dxa"/>
+            <w:shd w:val="clear" w:color="auto" w:fill="FFFFFF"/>
+            <w:tcBorders>
+              <w:top w:val="single" w:sz="4" w:space="0" w:color="CCCCCC"/>
+              <w:left w:val="single" w:sz="4" w:space="0" w:color="CCCCCC"/>
+              <w:bottom w:val="single" w:sz="4" w:space="0" w:color="CCCCCC"/>
+              <w:right w:val="single" w:sz="4" w:space="0" w:color="CCCCCC"/>
+            </w:tcBorders>
+          </w:tcPr>
+          <w:p>
+            <w:r>
+              <w:rPr>
+                <w:sz w:val="20"/>
+              </w:rPr>
+              <w:t>Built yt-dlp extractor (YouTube/TikTok), Firefox+Vision extractor (Instagram/RedNote), Lark reader/writer, watcher daemon, processor router.</w:t>
+            </w:r>
+          </w:p>
+        </w:tc>
+        <w:tc>
+          <w:tcPr>
+            <w:tcW w:type="dxa" w:w="2340"/>
+            <w:tcW w:w="2880" w:type="dxa"/>
+            <w:shd w:val="clear" w:color="auto" w:fill="FFFFFF"/>
+            <w:tcBorders>
+              <w:top w:val="single" w:sz="4" w:space="0" w:color="CCCCCC"/>
+              <w:left w:val="single" w:sz="4" w:space="0" w:color="CCCCCC"/>
+              <w:bottom w:val="single" w:sz="4" w:space="0" w:color="CCCCCC"/>
+              <w:right w:val="single" w:sz="4" w:space="0" w:color="CCCCCC"/>
+            </w:tcBorders>
+          </w:tcPr>
+          <w:p>
+            <w:r>
+              <w:rPr>
+                <w:sz w:val="20"/>
+              </w:rPr>
+              <w:t>System fills Lark columns A/D/E/G for all 4 platforms without manual steps.</w:t>
+            </w:r>
+          </w:p>
+        </w:tc>
+      </w:tr>
+      <w:tr>
+        <w:tc>
+          <w:tcPr>
+            <w:tcW w:type="dxa" w:w="2340"/>
+            <w:tcW w:w="1728" w:type="dxa"/>
+            <w:shd w:val="clear" w:color="auto" w:fill="F0F4FF"/>
+            <w:tcBorders>
+              <w:top w:val="single" w:sz="4" w:space="0" w:color="CCCCCC"/>
+              <w:left w:val="single" w:sz="4" w:space="0" w:color="CCCCCC"/>
+              <w:bottom w:val="single" w:sz="4" w:space="0" w:color="CCCCCC"/>
+              <w:right w:val="single" w:sz="4" w:space="0" w:color="CCCCCC"/>
+            </w:tcBorders>
+          </w:tcPr>
+          <w:p>
+            <w:r>
+              <w:rPr>
+                <w:sz w:val="20"/>
+              </w:rPr>
+              <w:t>Phase 2</w:t>
+              <w:br/>
+              <w:t>Quality &amp; Security</w:t>
+            </w:r>
+          </w:p>
+        </w:tc>
+        <w:tc>
+          <w:tcPr>
+            <w:tcW w:type="dxa" w:w="2340"/>
+            <w:tcW w:w="1440" w:type="dxa"/>
+            <w:shd w:val="clear" w:color="auto" w:fill="F0F4FF"/>
+            <w:tcBorders>
+              <w:top w:val="single" w:sz="4" w:space="0" w:color="CCCCCC"/>
+              <w:left w:val="single" w:sz="4" w:space="0" w:color="CCCCCC"/>
+              <w:bottom w:val="single" w:sz="4" w:space="0" w:color="CCCCCC"/>
+              <w:right w:val="single" w:sz="4" w:space="0" w:color="CCCCCC"/>
+            </w:tcBorders>
+          </w:tcPr>
+          <w:p>
+            <w:r>
+              <w:rPr>
+                <w:b/>
+                <w:color w:val="007000"/>
+                <w:sz w:val="20"/>
+              </w:rPr>
+              <w:t>DONE</w:t>
+            </w:r>
+          </w:p>
+        </w:tc>
+        <w:tc>
+          <w:tcPr>
+            <w:tcW w:type="dxa" w:w="2340"/>
+            <w:tcW w:w="4752" w:type="dxa"/>
+            <w:shd w:val="clear" w:color="auto" w:fill="F0F4FF"/>
+            <w:tcBorders>
+              <w:top w:val="single" w:sz="4" w:space="0" w:color="CCCCCC"/>
+              <w:left w:val="single" w:sz="4" w:space="0" w:color="CCCCCC"/>
+              <w:bottom w:val="single" w:sz="4" w:space="0" w:color="CCCCCC"/>
+              <w:right w:val="single" w:sz="4" w:space="0" w:color="CCCCCC"/>
+            </w:tcBorders>
+          </w:tcPr>
+          <w:p>
+            <w:r>
+              <w:rPr>
+                <w:sz w:val="20"/>
+              </w:rPr>
+              <w:t>283 automated tests (positive, negative, security, performance, stress). Retry logic, atomic writes, startup validation, shortcode security, structured logging.</w:t>
+            </w:r>
+          </w:p>
+        </w:tc>
+        <w:tc>
+          <w:tcPr>
+            <w:tcW w:type="dxa" w:w="2340"/>
+            <w:tcW w:w="2880" w:type="dxa"/>
+            <w:shd w:val="clear" w:color="auto" w:fill="F0F4FF"/>
+            <w:tcBorders>
+              <w:top w:val="single" w:sz="4" w:space="0" w:color="CCCCCC"/>
+              <w:left w:val="single" w:sz="4" w:space="0" w:color="CCCCCC"/>
+              <w:bottom w:val="single" w:sz="4" w:space="0" w:color="CCCCCC"/>
+              <w:right w:val="single" w:sz="4" w:space="0" w:color="CCCCCC"/>
+            </w:tcBorders>
+          </w:tcPr>
+          <w:p>
+            <w:r>
+              <w:rPr>
+                <w:sz w:val="20"/>
+              </w:rPr>
+              <w:t>All 283 pytest tests pass. No partial writes on crash.</w:t>
+            </w:r>
+          </w:p>
+        </w:tc>
+      </w:tr>
+      <w:tr>
+        <w:tc>
+          <w:tcPr>
+            <w:tcW w:type="dxa" w:w="2340"/>
+            <w:tcW w:w="1728" w:type="dxa"/>
+            <w:shd w:val="clear" w:color="auto" w:fill="FFFFFF"/>
+            <w:tcBorders>
+              <w:top w:val="single" w:sz="4" w:space="0" w:color="CCCCCC"/>
+              <w:left w:val="single" w:sz="4" w:space="0" w:color="CCCCCC"/>
+              <w:bottom w:val="single" w:sz="4" w:space="0" w:color="CCCCCC"/>
+              <w:right w:val="single" w:sz="4" w:space="0" w:color="CCCCCC"/>
+            </w:tcBorders>
+          </w:tcPr>
+          <w:p>
+            <w:r>
+              <w:rPr>
+                <w:sz w:val="20"/>
+              </w:rPr>
+              <w:t>Phase 3</w:t>
+              <w:br/>
+              <w:t>Documentation</w:t>
+            </w:r>
+          </w:p>
+        </w:tc>
+        <w:tc>
+          <w:tcPr>
+            <w:tcW w:type="dxa" w:w="2340"/>
+            <w:tcW w:w="1440" w:type="dxa"/>
+            <w:shd w:val="clear" w:color="auto" w:fill="FFFFFF"/>
+            <w:tcBorders>
+              <w:top w:val="single" w:sz="4" w:space="0" w:color="CCCCCC"/>
+              <w:left w:val="single" w:sz="4" w:space="0" w:color="CCCCCC"/>
+              <w:bottom w:val="single" w:sz="4" w:space="0" w:color="CCCCCC"/>
+              <w:right w:val="single" w:sz="4" w:space="0" w:color="CCCCCC"/>
+            </w:tcBorders>
+          </w:tcPr>
+          <w:p>
+            <w:r>
+              <w:rPr>
+                <w:b/>
+                <w:color w:val="C55A11"/>
+                <w:sz w:val="20"/>
+              </w:rPr>
+              <w:t>THIS WEEK</w:t>
+            </w:r>
+          </w:p>
+        </w:tc>
+        <w:tc>
+          <w:tcPr>
+            <w:tcW w:type="dxa" w:w="2340"/>
+            <w:tcW w:w="4752" w:type="dxa"/>
+            <w:shd w:val="clear" w:color="auto" w:fill="FFFFFF"/>
+            <w:tcBorders>
+              <w:top w:val="single" w:sz="4" w:space="0" w:color="CCCCCC"/>
+              <w:left w:val="single" w:sz="4" w:space="0" w:color="CCCCCC"/>
+              <w:bottom w:val="single" w:sz="4" w:space="0" w:color="CCCCCC"/>
+              <w:right w:val="single" w:sz="4" w:space="0" w:color="CCCCCC"/>
+            </w:tcBorders>
+          </w:tcPr>
+          <w:p>
+            <w:r>
+              <w:rPr>
+                <w:sz w:val="20"/>
+              </w:rPr>
+              <w:t>BRD v5.1: specific problem, quantified value, why AI, acceptance criteria. TDD v3.1: architecture paragraph, cohort timeline, tracking plan, risks.</w:t>
+            </w:r>
+          </w:p>
+        </w:tc>
+        <w:tc>
+          <w:tcPr>
+            <w:tcW w:type="dxa" w:w="2340"/>
+            <w:tcW w:w="2880" w:type="dxa"/>
+            <w:shd w:val="clear" w:color="auto" w:fill="FFFFFF"/>
+            <w:tcBorders>
+              <w:top w:val="single" w:sz="4" w:space="0" w:color="CCCCCC"/>
+              <w:left w:val="single" w:sz="4" w:space="0" w:color="CCCCCC"/>
+              <w:bottom w:val="single" w:sz="4" w:space="0" w:color="CCCCCC"/>
+              <w:right w:val="single" w:sz="4" w:space="0" w:color="CCCCCC"/>
+            </w:tcBorders>
+          </w:tcPr>
+          <w:p>
+            <w:r>
+              <w:rPr>
+                <w:sz w:val="20"/>
+              </w:rPr>
+              <w:t>Both documents submitted to class portal this session.</w:t>
+            </w:r>
+          </w:p>
+        </w:tc>
+      </w:tr>
+      <w:tr>
+        <w:tc>
+          <w:tcPr>
+            <w:tcW w:type="dxa" w:w="2340"/>
+            <w:tcW w:w="1728" w:type="dxa"/>
+            <w:shd w:val="clear" w:color="auto" w:fill="F0F4FF"/>
+            <w:tcBorders>
+              <w:top w:val="single" w:sz="4" w:space="0" w:color="CCCCCC"/>
+              <w:left w:val="single" w:sz="4" w:space="0" w:color="CCCCCC"/>
+              <w:bottom w:val="single" w:sz="4" w:space="0" w:color="CCCCCC"/>
+              <w:right w:val="single" w:sz="4" w:space="0" w:color="CCCCCC"/>
+            </w:tcBorders>
+          </w:tcPr>
+          <w:p>
+            <w:r>
+              <w:rPr>
+                <w:sz w:val="20"/>
+              </w:rPr>
+              <w:t>Phase 4</w:t>
+              <w:br/>
+              <w:t>Live Validation</w:t>
+            </w:r>
+          </w:p>
+        </w:tc>
+        <w:tc>
+          <w:tcPr>
+            <w:tcW w:type="dxa" w:w="2340"/>
+            <w:tcW w:w="1440" w:type="dxa"/>
+            <w:shd w:val="clear" w:color="auto" w:fill="F0F4FF"/>
+            <w:tcBorders>
+              <w:top w:val="single" w:sz="4" w:space="0" w:color="CCCCCC"/>
+              <w:left w:val="single" w:sz="4" w:space="0" w:color="CCCCCC"/>
+              <w:bottom w:val="single" w:sz="4" w:space="0" w:color="CCCCCC"/>
+              <w:right w:val="single" w:sz="4" w:space="0" w:color="CCCCCC"/>
+            </w:tcBorders>
+          </w:tcPr>
+          <w:p>
+            <w:r>
+              <w:rPr>
+                <w:b/>
+                <w:color w:val="4472C4"/>
+                <w:sz w:val="20"/>
+              </w:rPr>
+              <w:t>NEXT CLASS</w:t>
+            </w:r>
+          </w:p>
+        </w:tc>
+        <w:tc>
+          <w:tcPr>
+            <w:tcW w:type="dxa" w:w="2340"/>
+            <w:tcW w:w="4752" w:type="dxa"/>
+            <w:shd w:val="clear" w:color="auto" w:fill="F0F4FF"/>
+            <w:tcBorders>
+              <w:top w:val="single" w:sz="4" w:space="0" w:color="CCCCCC"/>
+              <w:left w:val="single" w:sz="4" w:space="0" w:color="CCCCCC"/>
+              <w:bottom w:val="single" w:sz="4" w:space="0" w:color="CCCCCC"/>
+              <w:right w:val="single" w:sz="4" w:space="0" w:color="CCCCCC"/>
+            </w:tcBorders>
+          </w:tcPr>
+          <w:p>
+            <w:r>
+              <w:rPr>
+                <w:sz w:val="20"/>
+              </w:rPr>
+              <w:t>Run system on 10 real videos (mix of YouTube, Instagram, TikTok, RedNote). Compare extracted data to actual platform values. Measure time: paste URLs to Lark filled.</w:t>
+            </w:r>
+          </w:p>
+        </w:tc>
+        <w:tc>
+          <w:tcPr>
+            <w:tcW w:type="dxa" w:w="2340"/>
+            <w:tcW w:w="2880" w:type="dxa"/>
+            <w:shd w:val="clear" w:color="auto" w:fill="F0F4FF"/>
+            <w:tcBorders>
+              <w:top w:val="single" w:sz="4" w:space="0" w:color="CCCCCC"/>
+              <w:left w:val="single" w:sz="4" w:space="0" w:color="CCCCCC"/>
+              <w:bottom w:val="single" w:sz="4" w:space="0" w:color="CCCCCC"/>
+              <w:right w:val="single" w:sz="4" w:space="0" w:color="CCCCCC"/>
+            </w:tcBorders>
+          </w:tcPr>
+          <w:p>
+            <w:r>
+              <w:rPr>
+                <w:sz w:val="20"/>
+              </w:rPr>
+              <w:t>95%+ accuracy on view counts. All hashtags removed. Time under 5 min per URL.</w:t>
+            </w:r>
+          </w:p>
+        </w:tc>
+      </w:tr>
+      <w:tr>
+        <w:tc>
+          <w:tcPr>
+            <w:tcW w:type="dxa" w:w="2340"/>
+            <w:tcW w:w="1728" w:type="dxa"/>
+            <w:shd w:val="clear" w:color="auto" w:fill="FFFFFF"/>
+            <w:tcBorders>
+              <w:top w:val="single" w:sz="4" w:space="0" w:color="CCCCCC"/>
+              <w:left w:val="single" w:sz="4" w:space="0" w:color="CCCCCC"/>
+              <w:bottom w:val="single" w:sz="4" w:space="0" w:color="CCCCCC"/>
+              <w:right w:val="single" w:sz="4" w:space="0" w:color="CCCCCC"/>
+            </w:tcBorders>
+          </w:tcPr>
+          <w:p>
+            <w:r>
+              <w:rPr>
+                <w:sz w:val="20"/>
+              </w:rPr>
+              <w:t>Phase 5</w:t>
+              <w:br/>
+              <w:t>Final Demo</w:t>
+            </w:r>
+          </w:p>
+        </w:tc>
+        <w:tc>
+          <w:tcPr>
+            <w:tcW w:type="dxa" w:w="2340"/>
+            <w:tcW w:w="1440" w:type="dxa"/>
+            <w:shd w:val="clear" w:color="auto" w:fill="FFFFFF"/>
+            <w:tcBorders>
+              <w:top w:val="single" w:sz="4" w:space="0" w:color="CCCCCC"/>
+              <w:left w:val="single" w:sz="4" w:space="0" w:color="CCCCCC"/>
+              <w:bottom w:val="single" w:sz="4" w:space="0" w:color="CCCCCC"/>
+              <w:right w:val="single" w:sz="4" w:space="0" w:color="CCCCCC"/>
+            </w:tcBorders>
+          </w:tcPr>
+          <w:p>
+            <w:r>
+              <w:rPr>
+                <w:b/>
+                <w:color w:val="4472C4"/>
+                <w:sz w:val="20"/>
+              </w:rPr>
+              <w:t>NEXT CLASS</w:t>
+            </w:r>
+          </w:p>
+        </w:tc>
+        <w:tc>
+          <w:tcPr>
+            <w:tcW w:type="dxa" w:w="2340"/>
+            <w:tcW w:w="4752" w:type="dxa"/>
+            <w:shd w:val="clear" w:color="auto" w:fill="FFFFFF"/>
+            <w:tcBorders>
+              <w:top w:val="single" w:sz="4" w:space="0" w:color="CCCCCC"/>
+              <w:left w:val="single" w:sz="4" w:space="0" w:color="CCCCCC"/>
+              <w:bottom w:val="single" w:sz="4" w:space="0" w:color="CCCCCC"/>
+              <w:right w:val="single" w:sz="4" w:space="0" w:color="CCCCCC"/>
+            </w:tcBorders>
+          </w:tcPr>
+          <w:p>
+            <w:r>
+              <w:rPr>
+                <w:sz w:val="20"/>
+              </w:rPr>
+              <w:t>Record a short screen capture showing: paste URL in Lark, watcher processes automatically, columns fill in real time. Present quantified results: time saved, error rate, test coverage.</w:t>
+            </w:r>
+          </w:p>
+        </w:tc>
+        <w:tc>
+          <w:tcPr>
+            <w:tcW w:type="dxa" w:w="2340"/>
+            <w:tcW w:w="2880" w:type="dxa"/>
+            <w:shd w:val="clear" w:color="auto" w:fill="FFFFFF"/>
+            <w:tcBorders>
+              <w:top w:val="single" w:sz="4" w:space="0" w:color="CCCCCC"/>
+              <w:left w:val="single" w:sz="4" w:space="0" w:color="CCCCCC"/>
+              <w:bottom w:val="single" w:sz="4" w:space="0" w:color="CCCCCC"/>
+              <w:right w:val="single" w:sz="4" w:space="0" w:color="CCCCCC"/>
+            </w:tcBorders>
+          </w:tcPr>
+          <w:p>
+            <w:r>
+              <w:rPr>
+                <w:sz w:val="20"/>
+              </w:rPr>
+              <w:t>Demo video shows end-to-end flow in under 3 minutes. Before/after time comparison presented.</w:t>
+            </w:r>
+          </w:p>
+        </w:tc>
+      </w:tr>
+    </w:tbl>
+    <w:p/>
+    <w:p/>
+    <w:p>
+      <w:pPr>
+        <w:pStyle w:val="Heading1"/>
+      </w:pPr>
+      <w:r>
+        <w:t>1.2 Tracking Plan — Where Metrics Live</w:t>
+      </w:r>
+    </w:p>
+    <w:p>
+      <w:pPr/>
+      <w:r>
+        <w:rPr>
+          <w:b w:val="0"/>
+          <w:i w:val="0"/>
+          <w:sz w:val="22"/>
+        </w:rPr>
+        <w:t>The Lark Bitable IS the tracking system. Every row in the sheet represents one video. The system writes four metrics per row. Here is what each metric means and how accuracy will be verified during the validation phase:</w:t>
+      </w:r>
+    </w:p>
+    <w:p/>
+    <w:tbl>
+      <w:tblPr>
+        <w:tblW w:type="auto" w:w="0"/>
+        <w:jc w:val="left"/>
+        <w:tblLook w:firstColumn="1" w:firstRow="1" w:lastColumn="0" w:lastRow="0" w:noHBand="0" w:noVBand="1" w:val="04A0"/>
+      </w:tblPr>
+      <w:tblGrid>
+        <w:gridCol w:w="2340"/>
+        <w:gridCol w:w="2340"/>
+        <w:gridCol w:w="2340"/>
+        <w:gridCol w:w="2340"/>
+      </w:tblGrid>
+      <w:tr>
+        <w:tc>
+          <w:tcPr>
+            <w:tcW w:type="dxa" w:w="2340"/>
+            <w:tcW w:w="1872" w:type="dxa"/>
+            <w:shd w:val="clear" w:color="auto" w:fill="1F497D"/>
+            <w:tcBorders>
+              <w:top w:val="single" w:sz="4" w:space="0" w:color="1F497D"/>
+              <w:left w:val="single" w:sz="4" w:space="0" w:color="1F497D"/>
+              <w:bottom w:val="single" w:sz="4" w:space="0" w:color="1F497D"/>
+              <w:right w:val="single" w:sz="4" w:space="0" w:color="1F497D"/>
+            </w:tcBorders>
+          </w:tcPr>
+          <w:p>
+            <w:r>
+              <w:rPr>
+                <w:b/>
+                <w:color w:val="FFFFFF"/>
+                <w:sz w:val="20"/>
+              </w:rPr>
+              <w:t>Metric</w:t>
+            </w:r>
+          </w:p>
+        </w:tc>
+        <w:tc>
+          <w:tcPr>
+            <w:tcW w:type="dxa" w:w="2340"/>
+            <w:tcW w:w="1584" w:type="dxa"/>
+            <w:shd w:val="clear" w:color="auto" w:fill="1F497D"/>
+            <w:tcBorders>
+              <w:top w:val="single" w:sz="4" w:space="0" w:color="1F497D"/>
+              <w:left w:val="single" w:sz="4" w:space="0" w:color="1F497D"/>
+              <w:bottom w:val="single" w:sz="4" w:space="0" w:color="1F497D"/>
+              <w:right w:val="single" w:sz="4" w:space="0" w:color="1F497D"/>
+            </w:tcBorders>
+          </w:tcPr>
+          <w:p>
+            <w:r>
+              <w:rPr>
+                <w:b/>
+                <w:color w:val="FFFFFF"/>
+                <w:sz w:val="20"/>
+              </w:rPr>
+              <w:t>Lark Column</w:t>
+            </w:r>
+          </w:p>
+        </w:tc>
+        <w:tc>
+          <w:tcPr>
+            <w:tcW w:type="dxa" w:w="2340"/>
+            <w:tcW w:w="2880" w:type="dxa"/>
+            <w:shd w:val="clear" w:color="auto" w:fill="1F497D"/>
+            <w:tcBorders>
+              <w:top w:val="single" w:sz="4" w:space="0" w:color="1F497D"/>
+              <w:left w:val="single" w:sz="4" w:space="0" w:color="1F497D"/>
+              <w:bottom w:val="single" w:sz="4" w:space="0" w:color="1F497D"/>
+              <w:right w:val="single" w:sz="4" w:space="0" w:color="1F497D"/>
+            </w:tcBorders>
+          </w:tcPr>
+          <w:p>
+            <w:r>
+              <w:rPr>
+                <w:b/>
+                <w:color w:val="FFFFFF"/>
+                <w:sz w:val="20"/>
+              </w:rPr>
+              <w:t>What It Tracks</w:t>
+            </w:r>
+          </w:p>
+        </w:tc>
+        <w:tc>
+          <w:tcPr>
+            <w:tcW w:type="dxa" w:w="2340"/>
+            <w:tcW w:w="4464" w:type="dxa"/>
+            <w:shd w:val="clear" w:color="auto" w:fill="1F497D"/>
+            <w:tcBorders>
+              <w:top w:val="single" w:sz="4" w:space="0" w:color="1F497D"/>
+              <w:left w:val="single" w:sz="4" w:space="0" w:color="1F497D"/>
+              <w:bottom w:val="single" w:sz="4" w:space="0" w:color="1F497D"/>
+              <w:right w:val="single" w:sz="4" w:space="0" w:color="1F497D"/>
+            </w:tcBorders>
+          </w:tcPr>
+          <w:p>
+            <w:r>
+              <w:rPr>
+                <w:b/>
+                <w:color w:val="FFFFFF"/>
+                <w:sz w:val="20"/>
+              </w:rPr>
+              <w:t>How Accuracy Is Verified</w:t>
+            </w:r>
+          </w:p>
+        </w:tc>
+      </w:tr>
+      <w:tr>
+        <w:tc>
+          <w:tcPr>
+            <w:tcW w:type="dxa" w:w="2340"/>
+            <w:tcW w:w="1872" w:type="dxa"/>
+            <w:shd w:val="clear" w:color="auto" w:fill="FFFFFF"/>
+            <w:tcBorders>
+              <w:top w:val="single" w:sz="4" w:space="0" w:color="CCCCCC"/>
+              <w:left w:val="single" w:sz="4" w:space="0" w:color="CCCCCC"/>
+              <w:bottom w:val="single" w:sz="4" w:space="0" w:color="CCCCCC"/>
+              <w:right w:val="single" w:sz="4" w:space="0" w:color="CCCCCC"/>
+            </w:tcBorders>
+          </w:tcPr>
+          <w:p>
+            <w:r>
+              <w:rPr>
+                <w:sz w:val="20"/>
+              </w:rPr>
+              <w:t>Posted Date</w:t>
+            </w:r>
+          </w:p>
+        </w:tc>
+        <w:tc>
+          <w:tcPr>
+            <w:tcW w:type="dxa" w:w="2340"/>
+            <w:tcW w:w="1584" w:type="dxa"/>
+            <w:shd w:val="clear" w:color="auto" w:fill="FFFFFF"/>
+            <w:tcBorders>
+              <w:top w:val="single" w:sz="4" w:space="0" w:color="CCCCCC"/>
+              <w:left w:val="single" w:sz="4" w:space="0" w:color="CCCCCC"/>
+              <w:bottom w:val="single" w:sz="4" w:space="0" w:color="CCCCCC"/>
+              <w:right w:val="single" w:sz="4" w:space="0" w:color="CCCCCC"/>
+            </w:tcBorders>
+          </w:tcPr>
+          <w:p>
+            <w:r>
+              <w:rPr>
+                <w:sz w:val="20"/>
+              </w:rPr>
+              <w:t>Column A</w:t>
+            </w:r>
+          </w:p>
+        </w:tc>
+        <w:tc>
+          <w:tcPr>
+            <w:tcW w:type="dxa" w:w="2340"/>
+            <w:tcW w:w="2880" w:type="dxa"/>
+            <w:shd w:val="clear" w:color="auto" w:fill="FFFFFF"/>
+            <w:tcBorders>
+              <w:top w:val="single" w:sz="4" w:space="0" w:color="CCCCCC"/>
+              <w:left w:val="single" w:sz="4" w:space="0" w:color="CCCCCC"/>
+              <w:bottom w:val="single" w:sz="4" w:space="0" w:color="CCCCCC"/>
+              <w:right w:val="single" w:sz="4" w:space="0" w:color="CCCCCC"/>
+            </w:tcBorders>
+          </w:tcPr>
+          <w:p>
+            <w:r>
+              <w:rPr>
+                <w:sz w:val="20"/>
+              </w:rPr>
+              <w:t>The original date the video was published on the platform.</w:t>
+            </w:r>
+          </w:p>
+        </w:tc>
+        <w:tc>
+          <w:tcPr>
+            <w:tcW w:type="dxa" w:w="2340"/>
+            <w:tcW w:w="4464" w:type="dxa"/>
+            <w:shd w:val="clear" w:color="auto" w:fill="FFFFFF"/>
+            <w:tcBorders>
+              <w:top w:val="single" w:sz="4" w:space="0" w:color="CCCCCC"/>
+              <w:left w:val="single" w:sz="4" w:space="0" w:color="CCCCCC"/>
+              <w:bottom w:val="single" w:sz="4" w:space="0" w:color="CCCCCC"/>
+              <w:right w:val="single" w:sz="4" w:space="0" w:color="CCCCCC"/>
+            </w:tcBorders>
+          </w:tcPr>
+          <w:p>
+            <w:r>
+              <w:rPr>
+                <w:sz w:val="20"/>
+              </w:rPr>
+              <w:t>Manually check 10 videos on platform. Compare to Column A. Pass if all 10 match.</w:t>
+            </w:r>
+          </w:p>
+        </w:tc>
+      </w:tr>
+      <w:tr>
+        <w:tc>
+          <w:tcPr>
+            <w:tcW w:type="dxa" w:w="2340"/>
+            <w:tcW w:w="1872" w:type="dxa"/>
+            <w:shd w:val="clear" w:color="auto" w:fill="F0F4FF"/>
+            <w:tcBorders>
+              <w:top w:val="single" w:sz="4" w:space="0" w:color="CCCCCC"/>
+              <w:left w:val="single" w:sz="4" w:space="0" w:color="CCCCCC"/>
+              <w:bottom w:val="single" w:sz="4" w:space="0" w:color="CCCCCC"/>
+              <w:right w:val="single" w:sz="4" w:space="0" w:color="CCCCCC"/>
+            </w:tcBorders>
+          </w:tcPr>
+          <w:p>
+            <w:r>
+              <w:rPr>
+                <w:sz w:val="20"/>
+              </w:rPr>
+              <w:t>Caption / Title</w:t>
+            </w:r>
+          </w:p>
+        </w:tc>
+        <w:tc>
+          <w:tcPr>
+            <w:tcW w:type="dxa" w:w="2340"/>
+            <w:tcW w:w="1584" w:type="dxa"/>
+            <w:shd w:val="clear" w:color="auto" w:fill="F0F4FF"/>
+            <w:tcBorders>
+              <w:top w:val="single" w:sz="4" w:space="0" w:color="CCCCCC"/>
+              <w:left w:val="single" w:sz="4" w:space="0" w:color="CCCCCC"/>
+              <w:bottom w:val="single" w:sz="4" w:space="0" w:color="CCCCCC"/>
+              <w:right w:val="single" w:sz="4" w:space="0" w:color="CCCCCC"/>
+            </w:tcBorders>
+          </w:tcPr>
+          <w:p>
+            <w:r>
+              <w:rPr>
+                <w:sz w:val="20"/>
+              </w:rPr>
+              <w:t>Column D</w:t>
+            </w:r>
+          </w:p>
+        </w:tc>
+        <w:tc>
+          <w:tcPr>
+            <w:tcW w:type="dxa" w:w="2340"/>
+            <w:tcW w:w="2880" w:type="dxa"/>
+            <w:shd w:val="clear" w:color="auto" w:fill="F0F4FF"/>
+            <w:tcBorders>
+              <w:top w:val="single" w:sz="4" w:space="0" w:color="CCCCCC"/>
+              <w:left w:val="single" w:sz="4" w:space="0" w:color="CCCCCC"/>
+              <w:bottom w:val="single" w:sz="4" w:space="0" w:color="CCCCCC"/>
+              <w:right w:val="single" w:sz="4" w:space="0" w:color="CCCCCC"/>
+            </w:tcBorders>
+          </w:tcPr>
+          <w:p>
+            <w:r>
+              <w:rPr>
+                <w:sz w:val="20"/>
+              </w:rPr>
+              <w:t>The video caption or title, with ALL hashtags removed.</w:t>
+            </w:r>
+          </w:p>
+        </w:tc>
+        <w:tc>
+          <w:tcPr>
+            <w:tcW w:type="dxa" w:w="2340"/>
+            <w:tcW w:w="4464" w:type="dxa"/>
+            <w:shd w:val="clear" w:color="auto" w:fill="F0F4FF"/>
+            <w:tcBorders>
+              <w:top w:val="single" w:sz="4" w:space="0" w:color="CCCCCC"/>
+              <w:left w:val="single" w:sz="4" w:space="0" w:color="CCCCCC"/>
+              <w:bottom w:val="single" w:sz="4" w:space="0" w:color="CCCCCC"/>
+              <w:right w:val="single" w:sz="4" w:space="0" w:color="CCCCCC"/>
+            </w:tcBorders>
+          </w:tcPr>
+          <w:p>
+            <w:r>
+              <w:rPr>
+                <w:sz w:val="20"/>
+              </w:rPr>
+              <w:t>Check Column D for any # character. Pass if zero hashtags found in any cell.</w:t>
+            </w:r>
+          </w:p>
+        </w:tc>
+      </w:tr>
+      <w:tr>
+        <w:tc>
+          <w:tcPr>
+            <w:tcW w:type="dxa" w:w="2340"/>
+            <w:tcW w:w="1872" w:type="dxa"/>
+            <w:shd w:val="clear" w:color="auto" w:fill="FFFFFF"/>
+            <w:tcBorders>
+              <w:top w:val="single" w:sz="4" w:space="0" w:color="CCCCCC"/>
+              <w:left w:val="single" w:sz="4" w:space="0" w:color="CCCCCC"/>
+              <w:bottom w:val="single" w:sz="4" w:space="0" w:color="CCCCCC"/>
+              <w:right w:val="single" w:sz="4" w:space="0" w:color="CCCCCC"/>
+            </w:tcBorders>
+          </w:tcPr>
+          <w:p>
+            <w:r>
+              <w:rPr>
+                <w:sz w:val="20"/>
+              </w:rPr>
+              <w:t>Content Type</w:t>
+            </w:r>
+          </w:p>
+        </w:tc>
+        <w:tc>
+          <w:tcPr>
+            <w:tcW w:type="dxa" w:w="2340"/>
+            <w:tcW w:w="1584" w:type="dxa"/>
+            <w:shd w:val="clear" w:color="auto" w:fill="FFFFFF"/>
+            <w:tcBorders>
+              <w:top w:val="single" w:sz="4" w:space="0" w:color="CCCCCC"/>
+              <w:left w:val="single" w:sz="4" w:space="0" w:color="CCCCCC"/>
+              <w:bottom w:val="single" w:sz="4" w:space="0" w:color="CCCCCC"/>
+              <w:right w:val="single" w:sz="4" w:space="0" w:color="CCCCCC"/>
+            </w:tcBorders>
+          </w:tcPr>
+          <w:p>
+            <w:r>
+              <w:rPr>
+                <w:sz w:val="20"/>
+              </w:rPr>
+              <w:t>Column E</w:t>
+            </w:r>
+          </w:p>
+        </w:tc>
+        <w:tc>
+          <w:tcPr>
+            <w:tcW w:type="dxa" w:w="2340"/>
+            <w:tcW w:w="2880" w:type="dxa"/>
+            <w:shd w:val="clear" w:color="auto" w:fill="FFFFFF"/>
+            <w:tcBorders>
+              <w:top w:val="single" w:sz="4" w:space="0" w:color="CCCCCC"/>
+              <w:left w:val="single" w:sz="4" w:space="0" w:color="CCCCCC"/>
+              <w:bottom w:val="single" w:sz="4" w:space="0" w:color="CCCCCC"/>
+              <w:right w:val="single" w:sz="4" w:space="0" w:color="CCCCCC"/>
+            </w:tcBorders>
+          </w:tcPr>
+          <w:p>
+            <w:r>
+              <w:rPr>
+                <w:sz w:val="20"/>
+              </w:rPr>
+              <w:t>Always "Content Casual" — hardcoded default.</w:t>
+            </w:r>
+          </w:p>
+        </w:tc>
+        <w:tc>
+          <w:tcPr>
+            <w:tcW w:type="dxa" w:w="2340"/>
+            <w:tcW w:w="4464" w:type="dxa"/>
+            <w:shd w:val="clear" w:color="auto" w:fill="FFFFFF"/>
+            <w:tcBorders>
+              <w:top w:val="single" w:sz="4" w:space="0" w:color="CCCCCC"/>
+              <w:left w:val="single" w:sz="4" w:space="0" w:color="CCCCCC"/>
+              <w:bottom w:val="single" w:sz="4" w:space="0" w:color="CCCCCC"/>
+              <w:right w:val="single" w:sz="4" w:space="0" w:color="CCCCCC"/>
+            </w:tcBorders>
+          </w:tcPr>
+          <w:p>
+            <w:r>
+              <w:rPr>
+                <w:sz w:val="20"/>
+              </w:rPr>
+              <w:t>Check Column E for all processed rows. Pass if every cell says exactly "Content Casual".</w:t>
+            </w:r>
+          </w:p>
+        </w:tc>
+      </w:tr>
+      <w:tr>
+        <w:tc>
+          <w:tcPr>
+            <w:tcW w:type="dxa" w:w="2340"/>
+            <w:tcW w:w="1872" w:type="dxa"/>
+            <w:shd w:val="clear" w:color="auto" w:fill="F0F4FF"/>
+            <w:tcBorders>
+              <w:top w:val="single" w:sz="4" w:space="0" w:color="CCCCCC"/>
+              <w:left w:val="single" w:sz="4" w:space="0" w:color="CCCCCC"/>
+              <w:bottom w:val="single" w:sz="4" w:space="0" w:color="CCCCCC"/>
+              <w:right w:val="single" w:sz="4" w:space="0" w:color="CCCCCC"/>
+            </w:tcBorders>
+          </w:tcPr>
+          <w:p>
+            <w:r>
+              <w:rPr>
+                <w:sz w:val="20"/>
+              </w:rPr>
+              <w:t>View Count (Reach)</w:t>
+            </w:r>
+          </w:p>
+        </w:tc>
+        <w:tc>
+          <w:tcPr>
+            <w:tcW w:type="dxa" w:w="2340"/>
+            <w:tcW w:w="1584" w:type="dxa"/>
+            <w:shd w:val="clear" w:color="auto" w:fill="F0F4FF"/>
+            <w:tcBorders>
+              <w:top w:val="single" w:sz="4" w:space="0" w:color="CCCCCC"/>
+              <w:left w:val="single" w:sz="4" w:space="0" w:color="CCCCCC"/>
+              <w:bottom w:val="single" w:sz="4" w:space="0" w:color="CCCCCC"/>
+              <w:right w:val="single" w:sz="4" w:space="0" w:color="CCCCCC"/>
+            </w:tcBorders>
+          </w:tcPr>
+          <w:p>
+            <w:r>
+              <w:rPr>
+                <w:sz w:val="20"/>
+              </w:rPr>
+              <w:t>Column G</w:t>
+            </w:r>
+          </w:p>
+        </w:tc>
+        <w:tc>
+          <w:tcPr>
+            <w:tcW w:type="dxa" w:w="2340"/>
+            <w:tcW w:w="2880" w:type="dxa"/>
+            <w:shd w:val="clear" w:color="auto" w:fill="F0F4FF"/>
+            <w:tcBorders>
+              <w:top w:val="single" w:sz="4" w:space="0" w:color="CCCCCC"/>
+              <w:left w:val="single" w:sz="4" w:space="0" w:color="CCCCCC"/>
+              <w:bottom w:val="single" w:sz="4" w:space="0" w:color="CCCCCC"/>
+              <w:right w:val="single" w:sz="4" w:space="0" w:color="CCCCCC"/>
+            </w:tcBorders>
+          </w:tcPr>
+          <w:p>
+            <w:r>
+              <w:rPr>
+                <w:sz w:val="20"/>
+              </w:rPr>
+              <w:t>Total views/plays as shown on the platform at time of processing.</w:t>
+            </w:r>
+          </w:p>
+        </w:tc>
+        <w:tc>
+          <w:tcPr>
+            <w:tcW w:type="dxa" w:w="2340"/>
+            <w:tcW w:w="4464" w:type="dxa"/>
+            <w:shd w:val="clear" w:color="auto" w:fill="F0F4FF"/>
+            <w:tcBorders>
+              <w:top w:val="single" w:sz="4" w:space="0" w:color="CCCCCC"/>
+              <w:left w:val="single" w:sz="4" w:space="0" w:color="CCCCCC"/>
+              <w:bottom w:val="single" w:sz="4" w:space="0" w:color="CCCCCC"/>
+              <w:right w:val="single" w:sz="4" w:space="0" w:color="CCCCCC"/>
+            </w:tcBorders>
+          </w:tcPr>
+          <w:p>
+            <w:r>
+              <w:rPr>
+                <w:sz w:val="20"/>
+              </w:rPr>
+              <w:t>Manually check 10 videos. Compare Column G to platform count. Pass if within 5%.</w:t>
+            </w:r>
+          </w:p>
+        </w:tc>
+      </w:tr>
+    </w:tbl>
+    <w:p/>
+    <w:p/>
+    <w:p>
+      <w:pPr/>
+      <w:r>
+        <w:rPr>
+          <w:b/>
+          <w:i w:val="0"/>
+          <w:sz w:val="22"/>
+        </w:rPr>
+        <w:t>System performance metrics (tracked in logs/auto_count.log):</w:t>
+      </w:r>
+    </w:p>
+    <w:p/>
+    <w:tbl>
+      <w:tblPr>
+        <w:tblW w:type="auto" w:w="0"/>
+        <w:jc w:val="left"/>
+        <w:tblLook w:firstColumn="1" w:firstRow="1" w:lastColumn="0" w:lastRow="0" w:noHBand="0" w:noVBand="1" w:val="04A0"/>
+      </w:tblPr>
+      <w:tblGrid>
+        <w:gridCol w:w="3120"/>
+        <w:gridCol w:w="3120"/>
+        <w:gridCol w:w="3120"/>
+      </w:tblGrid>
+      <w:tr>
+        <w:tc>
+          <w:tcPr>
+            <w:tcW w:type="dxa" w:w="3120"/>
+            <w:tcW w:w="3600" w:type="dxa"/>
+            <w:shd w:val="clear" w:color="auto" w:fill="1F497D"/>
+            <w:tcBorders>
+              <w:top w:val="single" w:sz="4" w:space="0" w:color="1F497D"/>
+              <w:left w:val="single" w:sz="4" w:space="0" w:color="1F497D"/>
+              <w:bottom w:val="single" w:sz="4" w:space="0" w:color="1F497D"/>
+              <w:right w:val="single" w:sz="4" w:space="0" w:color="1F497D"/>
+            </w:tcBorders>
+          </w:tcPr>
+          <w:p>
+            <w:r>
+              <w:rPr>
+                <w:b/>
+                <w:color w:val="FFFFFF"/>
+                <w:sz w:val="20"/>
+              </w:rPr>
+              <w:t>Performance Metric</w:t>
+            </w:r>
+          </w:p>
+        </w:tc>
+        <w:tc>
+          <w:tcPr>
+            <w:tcW w:type="dxa" w:w="3120"/>
+            <w:tcW w:w="2880" w:type="dxa"/>
+            <w:shd w:val="clear" w:color="auto" w:fill="1F497D"/>
+            <w:tcBorders>
+              <w:top w:val="single" w:sz="4" w:space="0" w:color="1F497D"/>
+              <w:left w:val="single" w:sz="4" w:space="0" w:color="1F497D"/>
+              <w:bottom w:val="single" w:sz="4" w:space="0" w:color="1F497D"/>
+              <w:right w:val="single" w:sz="4" w:space="0" w:color="1F497D"/>
+            </w:tcBorders>
+          </w:tcPr>
+          <w:p>
+            <w:r>
+              <w:rPr>
+                <w:b/>
+                <w:color w:val="FFFFFF"/>
+                <w:sz w:val="20"/>
+              </w:rPr>
+              <w:t>Target</w:t>
+            </w:r>
+          </w:p>
+        </w:tc>
+        <w:tc>
+          <w:tcPr>
+            <w:tcW w:type="dxa" w:w="3120"/>
+            <w:tcW w:w="4320" w:type="dxa"/>
+            <w:shd w:val="clear" w:color="auto" w:fill="1F497D"/>
+            <w:tcBorders>
+              <w:top w:val="single" w:sz="4" w:space="0" w:color="1F497D"/>
+              <w:left w:val="single" w:sz="4" w:space="0" w:color="1F497D"/>
+              <w:bottom w:val="single" w:sz="4" w:space="0" w:color="1F497D"/>
+              <w:right w:val="single" w:sz="4" w:space="0" w:color="1F497D"/>
+            </w:tcBorders>
+          </w:tcPr>
+          <w:p>
+            <w:r>
+              <w:rPr>
+                <w:b/>
+                <w:color w:val="FFFFFF"/>
+                <w:sz w:val="20"/>
+              </w:rPr>
+              <w:t>Where It Is Logged</w:t>
+            </w:r>
+          </w:p>
+        </w:tc>
+      </w:tr>
+      <w:tr>
+        <w:tc>
+          <w:tcPr>
+            <w:tcW w:type="dxa" w:w="3120"/>
+            <w:tcW w:w="3600" w:type="dxa"/>
+            <w:shd w:val="clear" w:color="auto" w:fill="FFFFFF"/>
+            <w:tcBorders>
+              <w:top w:val="single" w:sz="4" w:space="0" w:color="CCCCCC"/>
+              <w:left w:val="single" w:sz="4" w:space="0" w:color="CCCCCC"/>
+              <w:bottom w:val="single" w:sz="4" w:space="0" w:color="CCCCCC"/>
+              <w:right w:val="single" w:sz="4" w:space="0" w:color="CCCCCC"/>
+            </w:tcBorders>
+          </w:tcPr>
+          <w:p>
+            <w:r>
+              <w:rPr>
+                <w:sz w:val="20"/>
+              </w:rPr>
+              <w:t>Processing time per URL</w:t>
+            </w:r>
+          </w:p>
+        </w:tc>
+        <w:tc>
+          <w:tcPr>
+            <w:tcW w:type="dxa" w:w="3120"/>
+            <w:tcW w:w="2880" w:type="dxa"/>
+            <w:shd w:val="clear" w:color="auto" w:fill="FFFFFF"/>
+            <w:tcBorders>
+              <w:top w:val="single" w:sz="4" w:space="0" w:color="CCCCCC"/>
+              <w:left w:val="single" w:sz="4" w:space="0" w:color="CCCCCC"/>
+              <w:bottom w:val="single" w:sz="4" w:space="0" w:color="CCCCCC"/>
+              <w:right w:val="single" w:sz="4" w:space="0" w:color="CCCCCC"/>
+            </w:tcBorders>
+          </w:tcPr>
+          <w:p>
+            <w:r>
+              <w:rPr>
+                <w:sz w:val="20"/>
+              </w:rPr>
+              <w:t>Under 5 minutes</w:t>
+            </w:r>
+          </w:p>
+        </w:tc>
+        <w:tc>
+          <w:tcPr>
+            <w:tcW w:type="dxa" w:w="3120"/>
+            <w:tcW w:w="4320" w:type="dxa"/>
+            <w:shd w:val="clear" w:color="auto" w:fill="FFFFFF"/>
+            <w:tcBorders>
+              <w:top w:val="single" w:sz="4" w:space="0" w:color="CCCCCC"/>
+              <w:left w:val="single" w:sz="4" w:space="0" w:color="CCCCCC"/>
+              <w:bottom w:val="single" w:sz="4" w:space="0" w:color="CCCCCC"/>
+              <w:right w:val="single" w:sz="4" w:space="0" w:color="CCCCCC"/>
+            </w:tcBorders>
+          </w:tcPr>
+          <w:p>
+            <w:r>
+              <w:rPr>
+                <w:sz w:val="20"/>
+              </w:rPr>
+              <w:t>Logged as INFO with timestamp per record_id</w:t>
+            </w:r>
+          </w:p>
+        </w:tc>
+      </w:tr>
+      <w:tr>
+        <w:tc>
+          <w:tcPr>
+            <w:tcW w:type="dxa" w:w="3120"/>
+            <w:tcW w:w="3600" w:type="dxa"/>
+            <w:shd w:val="clear" w:color="auto" w:fill="F0F4FF"/>
+            <w:tcBorders>
+              <w:top w:val="single" w:sz="4" w:space="0" w:color="CCCCCC"/>
+              <w:left w:val="single" w:sz="4" w:space="0" w:color="CCCCCC"/>
+              <w:bottom w:val="single" w:sz="4" w:space="0" w:color="CCCCCC"/>
+              <w:right w:val="single" w:sz="4" w:space="0" w:color="CCCCCC"/>
+            </w:tcBorders>
+          </w:tcPr>
+          <w:p>
+            <w:r>
+              <w:rPr>
+                <w:sz w:val="20"/>
+              </w:rPr>
+              <w:t>Success rate per cycle</w:t>
+            </w:r>
+          </w:p>
+        </w:tc>
+        <w:tc>
+          <w:tcPr>
+            <w:tcW w:type="dxa" w:w="3120"/>
+            <w:tcW w:w="2880" w:type="dxa"/>
+            <w:shd w:val="clear" w:color="auto" w:fill="F0F4FF"/>
+            <w:tcBorders>
+              <w:top w:val="single" w:sz="4" w:space="0" w:color="CCCCCC"/>
+              <w:left w:val="single" w:sz="4" w:space="0" w:color="CCCCCC"/>
+              <w:bottom w:val="single" w:sz="4" w:space="0" w:color="CCCCCC"/>
+              <w:right w:val="single" w:sz="4" w:space="0" w:color="CCCCCC"/>
+            </w:tcBorders>
+          </w:tcPr>
+          <w:p>
+            <w:r>
+              <w:rPr>
+                <w:sz w:val="20"/>
+              </w:rPr>
+              <w:t>95%+</w:t>
+            </w:r>
+          </w:p>
+        </w:tc>
+        <w:tc>
+          <w:tcPr>
+            <w:tcW w:type="dxa" w:w="3120"/>
+            <w:tcW w:w="4320" w:type="dxa"/>
+            <w:shd w:val="clear" w:color="auto" w:fill="F0F4FF"/>
+            <w:tcBorders>
+              <w:top w:val="single" w:sz="4" w:space="0" w:color="CCCCCC"/>
+              <w:left w:val="single" w:sz="4" w:space="0" w:color="CCCCCC"/>
+              <w:bottom w:val="single" w:sz="4" w:space="0" w:color="CCCCCC"/>
+              <w:right w:val="single" w:sz="4" w:space="0" w:color="CCCCCC"/>
+            </w:tcBorders>
+          </w:tcPr>
+          <w:p>
+            <w:r>
+              <w:rPr>
+                <w:sz w:val="20"/>
+              </w:rPr>
+              <w:t>Logged as "X OK, Y error(s)" at end of each watcher cycle</w:t>
+            </w:r>
+          </w:p>
+        </w:tc>
+      </w:tr>
+      <w:tr>
+        <w:tc>
+          <w:tcPr>
+            <w:tcW w:type="dxa" w:w="3120"/>
+            <w:tcW w:w="3600" w:type="dxa"/>
+            <w:shd w:val="clear" w:color="auto" w:fill="FFFFFF"/>
+            <w:tcBorders>
+              <w:top w:val="single" w:sz="4" w:space="0" w:color="CCCCCC"/>
+              <w:left w:val="single" w:sz="4" w:space="0" w:color="CCCCCC"/>
+              <w:bottom w:val="single" w:sz="4" w:space="0" w:color="CCCCCC"/>
+              <w:right w:val="single" w:sz="4" w:space="0" w:color="CCCCCC"/>
+            </w:tcBorders>
+          </w:tcPr>
+          <w:p>
+            <w:r>
+              <w:rPr>
+                <w:sz w:val="20"/>
+              </w:rPr>
+              <w:t>Retry count</w:t>
+            </w:r>
+          </w:p>
+        </w:tc>
+        <w:tc>
+          <w:tcPr>
+            <w:tcW w:type="dxa" w:w="3120"/>
+            <w:tcW w:w="2880" w:type="dxa"/>
+            <w:shd w:val="clear" w:color="auto" w:fill="FFFFFF"/>
+            <w:tcBorders>
+              <w:top w:val="single" w:sz="4" w:space="0" w:color="CCCCCC"/>
+              <w:left w:val="single" w:sz="4" w:space="0" w:color="CCCCCC"/>
+              <w:bottom w:val="single" w:sz="4" w:space="0" w:color="CCCCCC"/>
+              <w:right w:val="single" w:sz="4" w:space="0" w:color="CCCCCC"/>
+            </w:tcBorders>
+          </w:tcPr>
+          <w:p>
+            <w:r>
+              <w:rPr>
+                <w:sz w:val="20"/>
+              </w:rPr>
+              <w:t>0 retries in normal conditions</w:t>
+            </w:r>
+          </w:p>
+        </w:tc>
+        <w:tc>
+          <w:tcPr>
+            <w:tcW w:type="dxa" w:w="3120"/>
+            <w:tcW w:w="4320" w:type="dxa"/>
+            <w:shd w:val="clear" w:color="auto" w:fill="FFFFFF"/>
+            <w:tcBorders>
+              <w:top w:val="single" w:sz="4" w:space="0" w:color="CCCCCC"/>
+              <w:left w:val="single" w:sz="4" w:space="0" w:color="CCCCCC"/>
+              <w:bottom w:val="single" w:sz="4" w:space="0" w:color="CCCCCC"/>
+              <w:right w:val="single" w:sz="4" w:space="0" w:color="CCCCCC"/>
+            </w:tcBorders>
+          </w:tcPr>
+          <w:p>
+            <w:r>
+              <w:rPr>
+                <w:sz w:val="20"/>
+              </w:rPr>
+              <w:t>Logged as WARNING when a retry is triggered</w:t>
+            </w:r>
+          </w:p>
+        </w:tc>
+      </w:tr>
+      <w:tr>
+        <w:tc>
+          <w:tcPr>
+            <w:tcW w:type="dxa" w:w="3120"/>
+            <w:tcW w:w="3600" w:type="dxa"/>
+            <w:shd w:val="clear" w:color="auto" w:fill="F0F4FF"/>
+            <w:tcBorders>
+              <w:top w:val="single" w:sz="4" w:space="0" w:color="CCCCCC"/>
+              <w:left w:val="single" w:sz="4" w:space="0" w:color="CCCCCC"/>
+              <w:bottom w:val="single" w:sz="4" w:space="0" w:color="CCCCCC"/>
+              <w:right w:val="single" w:sz="4" w:space="0" w:color="CCCCCC"/>
+            </w:tcBorders>
+          </w:tcPr>
+          <w:p>
+            <w:r>
+              <w:rPr>
+                <w:sz w:val="20"/>
+              </w:rPr>
+              <w:t>Test pass rate</w:t>
+            </w:r>
+          </w:p>
+        </w:tc>
+        <w:tc>
+          <w:tcPr>
+            <w:tcW w:type="dxa" w:w="3120"/>
+            <w:tcW w:w="2880" w:type="dxa"/>
+            <w:shd w:val="clear" w:color="auto" w:fill="F0F4FF"/>
+            <w:tcBorders>
+              <w:top w:val="single" w:sz="4" w:space="0" w:color="CCCCCC"/>
+              <w:left w:val="single" w:sz="4" w:space="0" w:color="CCCCCC"/>
+              <w:bottom w:val="single" w:sz="4" w:space="0" w:color="CCCCCC"/>
+              <w:right w:val="single" w:sz="4" w:space="0" w:color="CCCCCC"/>
+            </w:tcBorders>
+          </w:tcPr>
+          <w:p>
+            <w:r>
+              <w:rPr>
+                <w:sz w:val="20"/>
+              </w:rPr>
+              <w:t>283/283 (100%)</w:t>
+            </w:r>
+          </w:p>
+        </w:tc>
+        <w:tc>
+          <w:tcPr>
+            <w:tcW w:type="dxa" w:w="3120"/>
+            <w:tcW w:w="4320" w:type="dxa"/>
+            <w:shd w:val="clear" w:color="auto" w:fill="F0F4FF"/>
+            <w:tcBorders>
+              <w:top w:val="single" w:sz="4" w:space="0" w:color="CCCCCC"/>
+              <w:left w:val="single" w:sz="4" w:space="0" w:color="CCCCCC"/>
+              <w:bottom w:val="single" w:sz="4" w:space="0" w:color="CCCCCC"/>
+              <w:right w:val="single" w:sz="4" w:space="0" w:color="CCCCCC"/>
+            </w:tcBorders>
+          </w:tcPr>
+          <w:p>
+            <w:r>
+              <w:rPr>
+                <w:sz w:val="20"/>
+              </w:rPr>
+              <w:t>pytest output — run before each submission</w:t>
+            </w:r>
+          </w:p>
+        </w:tc>
+      </w:tr>
+    </w:tbl>
+    <w:p/>
+    <w:p/>
+    <w:p>
+      <w:pPr>
+        <w:pStyle w:val="Heading1"/>
+      </w:pPr>
+      <w:r>
+        <w:t>1.3 Risks &amp; Fallbacks if AI Hits Limits</w:t>
+      </w:r>
+    </w:p>
+    <w:p>
+      <w:pPr/>
+      <w:r>
+        <w:rPr>
+          <w:b w:val="0"/>
+          <w:i w:val="0"/>
+          <w:sz w:val="22"/>
+        </w:rPr>
+        <w:t>Claude Vision is reliable but not infallible. Every known failure mode has a specific fallback built into the system. Below are the real risks and what happens in each case:</w:t>
+      </w:r>
+    </w:p>
+    <w:p/>
+    <w:tbl>
+      <w:tblPr>
+        <w:tblW w:type="auto" w:w="0"/>
+        <w:jc w:val="left"/>
+        <w:tblLook w:firstColumn="1" w:firstRow="1" w:lastColumn="0" w:lastRow="0" w:noHBand="0" w:noVBand="1" w:val="04A0"/>
+      </w:tblPr>
+      <w:tblGrid>
+        <w:gridCol w:w="2340"/>
+        <w:gridCol w:w="2340"/>
+        <w:gridCol w:w="2340"/>
+        <w:gridCol w:w="2340"/>
+      </w:tblGrid>
+      <w:tr>
+        <w:tc>
+          <w:tcPr>
+            <w:tcW w:type="dxa" w:w="2340"/>
+            <w:tcW w:w="3168" w:type="dxa"/>
+            <w:shd w:val="clear" w:color="auto" w:fill="1F497D"/>
+            <w:tcBorders>
+              <w:top w:val="single" w:sz="4" w:space="0" w:color="1F497D"/>
+              <w:left w:val="single" w:sz="4" w:space="0" w:color="1F497D"/>
+              <w:bottom w:val="single" w:sz="4" w:space="0" w:color="1F497D"/>
+              <w:right w:val="single" w:sz="4" w:space="0" w:color="1F497D"/>
+            </w:tcBorders>
+          </w:tcPr>
+          <w:p>
+            <w:r>
+              <w:rPr>
+                <w:b/>
+                <w:color w:val="FFFFFF"/>
+                <w:sz w:val="20"/>
+              </w:rPr>
+              <w:t>Risk</w:t>
+            </w:r>
+          </w:p>
+        </w:tc>
+        <w:tc>
+          <w:tcPr>
+            <w:tcW w:type="dxa" w:w="2340"/>
+            <w:tcW w:w="1152" w:type="dxa"/>
+            <w:shd w:val="clear" w:color="auto" w:fill="1F497D"/>
+            <w:tcBorders>
+              <w:top w:val="single" w:sz="4" w:space="0" w:color="1F497D"/>
+              <w:left w:val="single" w:sz="4" w:space="0" w:color="1F497D"/>
+              <w:bottom w:val="single" w:sz="4" w:space="0" w:color="1F497D"/>
+              <w:right w:val="single" w:sz="4" w:space="0" w:color="1F497D"/>
+            </w:tcBorders>
+          </w:tcPr>
+          <w:p>
+            <w:r>
+              <w:rPr>
+                <w:b/>
+                <w:color w:val="FFFFFF"/>
+                <w:sz w:val="20"/>
+              </w:rPr>
+              <w:t>Likelihood</w:t>
+            </w:r>
+          </w:p>
+        </w:tc>
+        <w:tc>
+          <w:tcPr>
+            <w:tcW w:type="dxa" w:w="2340"/>
+            <w:tcW w:w="2880" w:type="dxa"/>
+            <w:shd w:val="clear" w:color="auto" w:fill="1F497D"/>
+            <w:tcBorders>
+              <w:top w:val="single" w:sz="4" w:space="0" w:color="1F497D"/>
+              <w:left w:val="single" w:sz="4" w:space="0" w:color="1F497D"/>
+              <w:bottom w:val="single" w:sz="4" w:space="0" w:color="1F497D"/>
+              <w:right w:val="single" w:sz="4" w:space="0" w:color="1F497D"/>
+            </w:tcBorders>
+          </w:tcPr>
+          <w:p>
+            <w:r>
+              <w:rPr>
+                <w:b/>
+                <w:color w:val="FFFFFF"/>
+                <w:sz w:val="20"/>
+              </w:rPr>
+              <w:t>What Happens</w:t>
+            </w:r>
+          </w:p>
+        </w:tc>
+        <w:tc>
+          <w:tcPr>
+            <w:tcW w:type="dxa" w:w="2340"/>
+            <w:tcW w:w="3600" w:type="dxa"/>
+            <w:shd w:val="clear" w:color="auto" w:fill="1F497D"/>
+            <w:tcBorders>
+              <w:top w:val="single" w:sz="4" w:space="0" w:color="1F497D"/>
+              <w:left w:val="single" w:sz="4" w:space="0" w:color="1F497D"/>
+              <w:bottom w:val="single" w:sz="4" w:space="0" w:color="1F497D"/>
+              <w:right w:val="single" w:sz="4" w:space="0" w:color="1F497D"/>
+            </w:tcBorders>
+          </w:tcPr>
+          <w:p>
+            <w:r>
+              <w:rPr>
+                <w:b/>
+                <w:color w:val="FFFFFF"/>
+                <w:sz w:val="20"/>
+              </w:rPr>
+              <w:t>Fallback</w:t>
+            </w:r>
+          </w:p>
+        </w:tc>
+      </w:tr>
+      <w:tr>
+        <w:tc>
+          <w:tcPr>
+            <w:tcW w:type="dxa" w:w="2340"/>
+            <w:tcW w:w="3168" w:type="dxa"/>
+            <w:shd w:val="clear" w:color="auto" w:fill="FFFFFF"/>
+            <w:tcBorders>
+              <w:top w:val="single" w:sz="4" w:space="0" w:color="CCCCCC"/>
+              <w:left w:val="single" w:sz="4" w:space="0" w:color="CCCCCC"/>
+              <w:bottom w:val="single" w:sz="4" w:space="0" w:color="CCCCCC"/>
+              <w:right w:val="single" w:sz="4" w:space="0" w:color="CCCCCC"/>
+            </w:tcBorders>
+          </w:tcPr>
+          <w:p>
+            <w:r>
+              <w:rPr>
+                <w:sz w:val="20"/>
+              </w:rPr>
+              <w:t>Claude Vision extracts wrong view count</w:t>
+              <w:br/>
+              <w:t>(e.g. reads like count instead of view count)</w:t>
+            </w:r>
+          </w:p>
+        </w:tc>
+        <w:tc>
+          <w:tcPr>
+            <w:tcW w:type="dxa" w:w="2340"/>
+            <w:tcW w:w="1152" w:type="dxa"/>
+            <w:shd w:val="clear" w:color="auto" w:fill="FFFFFF"/>
+            <w:tcBorders>
+              <w:top w:val="single" w:sz="4" w:space="0" w:color="CCCCCC"/>
+              <w:left w:val="single" w:sz="4" w:space="0" w:color="CCCCCC"/>
+              <w:bottom w:val="single" w:sz="4" w:space="0" w:color="CCCCCC"/>
+              <w:right w:val="single" w:sz="4" w:space="0" w:color="CCCCCC"/>
+            </w:tcBorders>
+          </w:tcPr>
+          <w:p>
+            <w:r>
+              <w:rPr>
+                <w:b/>
+                <w:color w:val="C55A11"/>
+                <w:sz w:val="20"/>
+              </w:rPr>
+              <w:t>Medium</w:t>
+            </w:r>
+          </w:p>
+        </w:tc>
+        <w:tc>
+          <w:tcPr>
+            <w:tcW w:type="dxa" w:w="2340"/>
+            <w:tcW w:w="2880" w:type="dxa"/>
+            <w:shd w:val="clear" w:color="auto" w:fill="FFFFFF"/>
+            <w:tcBorders>
+              <w:top w:val="single" w:sz="4" w:space="0" w:color="CCCCCC"/>
+              <w:left w:val="single" w:sz="4" w:space="0" w:color="CCCCCC"/>
+              <w:bottom w:val="single" w:sz="4" w:space="0" w:color="CCCCCC"/>
+              <w:right w:val="single" w:sz="4" w:space="0" w:color="CCCCCC"/>
+            </w:tcBorders>
+          </w:tcPr>
+          <w:p>
+            <w:r>
+              <w:rPr>
+                <w:sz w:val="20"/>
+              </w:rPr>
+              <w:t>Column G has incorrect number. User may not notice unless they check.</w:t>
+            </w:r>
+          </w:p>
+        </w:tc>
+        <w:tc>
+          <w:tcPr>
+            <w:tcW w:type="dxa" w:w="2340"/>
+            <w:tcW w:w="3600" w:type="dxa"/>
+            <w:shd w:val="clear" w:color="auto" w:fill="FFFFFF"/>
+            <w:tcBorders>
+              <w:top w:val="single" w:sz="4" w:space="0" w:color="CCCCCC"/>
+              <w:left w:val="single" w:sz="4" w:space="0" w:color="CCCCCC"/>
+              <w:bottom w:val="single" w:sz="4" w:space="0" w:color="CCCCCC"/>
+              <w:right w:val="single" w:sz="4" w:space="0" w:color="CCCCCC"/>
+            </w:tcBorders>
+          </w:tcPr>
+          <w:p>
+            <w:r>
+              <w:rPr>
+                <w:sz w:val="20"/>
+              </w:rPr>
+              <w:t>GRID_PROMPT specialised for Instagram tells Claude exactly which number to read. User can manually correct Column G — system will not overwrite it on next run because it only processes rows where G is empty.</w:t>
+            </w:r>
+          </w:p>
+        </w:tc>
+      </w:tr>
+      <w:tr>
+        <w:tc>
+          <w:tcPr>
+            <w:tcW w:type="dxa" w:w="2340"/>
+            <w:tcW w:w="3168" w:type="dxa"/>
+            <w:shd w:val="clear" w:color="auto" w:fill="F0F4FF"/>
+            <w:tcBorders>
+              <w:top w:val="single" w:sz="4" w:space="0" w:color="CCCCCC"/>
+              <w:left w:val="single" w:sz="4" w:space="0" w:color="CCCCCC"/>
+              <w:bottom w:val="single" w:sz="4" w:space="0" w:color="CCCCCC"/>
+              <w:right w:val="single" w:sz="4" w:space="0" w:color="CCCCCC"/>
+            </w:tcBorders>
+          </w:tcPr>
+          <w:p>
+            <w:r>
+              <w:rPr>
+                <w:sz w:val="20"/>
+              </w:rPr>
+              <w:t>Claude API returns 529 (overloaded)</w:t>
+            </w:r>
+          </w:p>
+        </w:tc>
+        <w:tc>
+          <w:tcPr>
+            <w:tcW w:type="dxa" w:w="2340"/>
+            <w:tcW w:w="1152" w:type="dxa"/>
+            <w:shd w:val="clear" w:color="auto" w:fill="F0F4FF"/>
+            <w:tcBorders>
+              <w:top w:val="single" w:sz="4" w:space="0" w:color="CCCCCC"/>
+              <w:left w:val="single" w:sz="4" w:space="0" w:color="CCCCCC"/>
+              <w:bottom w:val="single" w:sz="4" w:space="0" w:color="CCCCCC"/>
+              <w:right w:val="single" w:sz="4" w:space="0" w:color="CCCCCC"/>
+            </w:tcBorders>
+          </w:tcPr>
+          <w:p>
+            <w:r>
+              <w:rPr>
+                <w:b/>
+                <w:color w:val="007000"/>
+                <w:sz w:val="20"/>
+              </w:rPr>
+              <w:t>Low</w:t>
+            </w:r>
+          </w:p>
+        </w:tc>
+        <w:tc>
+          <w:tcPr>
+            <w:tcW w:type="dxa" w:w="2340"/>
+            <w:tcW w:w="2880" w:type="dxa"/>
+            <w:shd w:val="clear" w:color="auto" w:fill="F0F4FF"/>
+            <w:tcBorders>
+              <w:top w:val="single" w:sz="4" w:space="0" w:color="CCCCCC"/>
+              <w:left w:val="single" w:sz="4" w:space="0" w:color="CCCCCC"/>
+              <w:bottom w:val="single" w:sz="4" w:space="0" w:color="CCCCCC"/>
+              <w:right w:val="single" w:sz="4" w:space="0" w:color="CCCCCC"/>
+            </w:tcBorders>
+          </w:tcPr>
+          <w:p>
+            <w:r>
+              <w:rPr>
+                <w:sz w:val="20"/>
+              </w:rPr>
+              <w:t>Extraction fails for that URL in this cycle.</w:t>
+            </w:r>
+          </w:p>
+        </w:tc>
+        <w:tc>
+          <w:tcPr>
+            <w:tcW w:type="dxa" w:w="2340"/>
+            <w:tcW w:w="3600" w:type="dxa"/>
+            <w:shd w:val="clear" w:color="auto" w:fill="F0F4FF"/>
+            <w:tcBorders>
+              <w:top w:val="single" w:sz="4" w:space="0" w:color="CCCCCC"/>
+              <w:left w:val="single" w:sz="4" w:space="0" w:color="CCCCCC"/>
+              <w:bottom w:val="single" w:sz="4" w:space="0" w:color="CCCCCC"/>
+              <w:right w:val="single" w:sz="4" w:space="0" w:color="CCCCCC"/>
+            </w:tcBorders>
+          </w:tcPr>
+          <w:p>
+            <w:r>
+              <w:rPr>
+                <w:sz w:val="20"/>
+              </w:rPr>
+              <w:t>Built-in retry: system waits 2s, 4s, 8s and retries up to 3 times automatically. If all retries fail, error is logged in plain English and URL is left for next cycle.</w:t>
+            </w:r>
+          </w:p>
+        </w:tc>
+      </w:tr>
+      <w:tr>
+        <w:tc>
+          <w:tcPr>
+            <w:tcW w:type="dxa" w:w="2340"/>
+            <w:tcW w:w="3168" w:type="dxa"/>
+            <w:shd w:val="clear" w:color="auto" w:fill="FFFFFF"/>
+            <w:tcBorders>
+              <w:top w:val="single" w:sz="4" w:space="0" w:color="CCCCCC"/>
+              <w:left w:val="single" w:sz="4" w:space="0" w:color="CCCCCC"/>
+              <w:bottom w:val="single" w:sz="4" w:space="0" w:color="CCCCCC"/>
+              <w:right w:val="single" w:sz="4" w:space="0" w:color="CCCCCC"/>
+            </w:tcBorders>
+          </w:tcPr>
+          <w:p>
+            <w:r>
+              <w:rPr>
+                <w:sz w:val="20"/>
+              </w:rPr>
+              <w:t>Instagram blocks Firefox (anti-bot detection)</w:t>
+            </w:r>
+          </w:p>
+        </w:tc>
+        <w:tc>
+          <w:tcPr>
+            <w:tcW w:type="dxa" w:w="2340"/>
+            <w:tcW w:w="1152" w:type="dxa"/>
+            <w:shd w:val="clear" w:color="auto" w:fill="FFFFFF"/>
+            <w:tcBorders>
+              <w:top w:val="single" w:sz="4" w:space="0" w:color="CCCCCC"/>
+              <w:left w:val="single" w:sz="4" w:space="0" w:color="CCCCCC"/>
+              <w:bottom w:val="single" w:sz="4" w:space="0" w:color="CCCCCC"/>
+              <w:right w:val="single" w:sz="4" w:space="0" w:color="CCCCCC"/>
+            </w:tcBorders>
+          </w:tcPr>
+          <w:p>
+            <w:r>
+              <w:rPr>
+                <w:b/>
+                <w:color w:val="C55A11"/>
+                <w:sz w:val="20"/>
+              </w:rPr>
+              <w:t>Medium</w:t>
+            </w:r>
+          </w:p>
+        </w:tc>
+        <w:tc>
+          <w:tcPr>
+            <w:tcW w:type="dxa" w:w="2340"/>
+            <w:tcW w:w="2880" w:type="dxa"/>
+            <w:shd w:val="clear" w:color="auto" w:fill="FFFFFF"/>
+            <w:tcBorders>
+              <w:top w:val="single" w:sz="4" w:space="0" w:color="CCCCCC"/>
+              <w:left w:val="single" w:sz="4" w:space="0" w:color="CCCCCC"/>
+              <w:bottom w:val="single" w:sz="4" w:space="0" w:color="CCCCCC"/>
+              <w:right w:val="single" w:sz="4" w:space="0" w:color="CCCCCC"/>
+            </w:tcBorders>
+          </w:tcPr>
+          <w:p>
+            <w:r>
+              <w:rPr>
+                <w:sz w:val="20"/>
+              </w:rPr>
+              <w:t>Page shows login screen or CAPTCHA instead of video. Screenshot sent to Claude has no data.</w:t>
+            </w:r>
+          </w:p>
+        </w:tc>
+        <w:tc>
+          <w:tcPr>
+            <w:tcW w:type="dxa" w:w="2340"/>
+            <w:tcW w:w="3600" w:type="dxa"/>
+            <w:shd w:val="clear" w:color="auto" w:fill="FFFFFF"/>
+            <w:tcBorders>
+              <w:top w:val="single" w:sz="4" w:space="0" w:color="CCCCCC"/>
+              <w:left w:val="single" w:sz="4" w:space="0" w:color="CCCCCC"/>
+              <w:bottom w:val="single" w:sz="4" w:space="0" w:color="CCCCCC"/>
+              <w:right w:val="single" w:sz="4" w:space="0" w:color="CCCCCC"/>
+            </w:tcBorders>
+          </w:tcPr>
+          <w:p>
+            <w:r>
+              <w:rPr>
+                <w:sz w:val="20"/>
+              </w:rPr>
+              <w:t>System detects null view_count and logs warning. User re-logs into Instagram via login_once.py (one command). Persistent session is saved and works again for weeks.</w:t>
+            </w:r>
+          </w:p>
+        </w:tc>
+      </w:tr>
+      <w:tr>
+        <w:tc>
+          <w:tcPr>
+            <w:tcW w:type="dxa" w:w="2340"/>
+            <w:tcW w:w="3168" w:type="dxa"/>
+            <w:shd w:val="clear" w:color="auto" w:fill="F0F4FF"/>
+            <w:tcBorders>
+              <w:top w:val="single" w:sz="4" w:space="0" w:color="CCCCCC"/>
+              <w:left w:val="single" w:sz="4" w:space="0" w:color="CCCCCC"/>
+              <w:bottom w:val="single" w:sz="4" w:space="0" w:color="CCCCCC"/>
+              <w:right w:val="single" w:sz="4" w:space="0" w:color="CCCCCC"/>
+            </w:tcBorders>
+          </w:tcPr>
+          <w:p>
+            <w:r>
+              <w:rPr>
+                <w:sz w:val="20"/>
+              </w:rPr>
+              <w:t>Platform changes UI (e.g. Instagram redesign)</w:t>
+            </w:r>
+          </w:p>
+        </w:tc>
+        <w:tc>
+          <w:tcPr>
+            <w:tcW w:type="dxa" w:w="2340"/>
+            <w:tcW w:w="1152" w:type="dxa"/>
+            <w:shd w:val="clear" w:color="auto" w:fill="F0F4FF"/>
+            <w:tcBorders>
+              <w:top w:val="single" w:sz="4" w:space="0" w:color="CCCCCC"/>
+              <w:left w:val="single" w:sz="4" w:space="0" w:color="CCCCCC"/>
+              <w:bottom w:val="single" w:sz="4" w:space="0" w:color="CCCCCC"/>
+              <w:right w:val="single" w:sz="4" w:space="0" w:color="CCCCCC"/>
+            </w:tcBorders>
+          </w:tcPr>
+          <w:p>
+            <w:r>
+              <w:rPr>
+                <w:b/>
+                <w:color w:val="C00000"/>
+                <w:sz w:val="20"/>
+              </w:rPr>
+              <w:t>High</w:t>
+            </w:r>
+          </w:p>
+        </w:tc>
+        <w:tc>
+          <w:tcPr>
+            <w:tcW w:type="dxa" w:w="2340"/>
+            <w:tcW w:w="2880" w:type="dxa"/>
+            <w:shd w:val="clear" w:color="auto" w:fill="F0F4FF"/>
+            <w:tcBorders>
+              <w:top w:val="single" w:sz="4" w:space="0" w:color="CCCCCC"/>
+              <w:left w:val="single" w:sz="4" w:space="0" w:color="CCCCCC"/>
+              <w:bottom w:val="single" w:sz="4" w:space="0" w:color="CCCCCC"/>
+              <w:right w:val="single" w:sz="4" w:space="0" w:color="CCCCCC"/>
+            </w:tcBorders>
+          </w:tcPr>
+          <w:p>
+            <w:r>
+              <w:rPr>
+                <w:sz w:val="20"/>
+              </w:rPr>
+              <w:t>Screenshot layout changes. Claude may read wrong element.</w:t>
+            </w:r>
+          </w:p>
+        </w:tc>
+        <w:tc>
+          <w:tcPr>
+            <w:tcW w:type="dxa" w:w="2340"/>
+            <w:tcW w:w="3600" w:type="dxa"/>
+            <w:shd w:val="clear" w:color="auto" w:fill="F0F4FF"/>
+            <w:tcBorders>
+              <w:top w:val="single" w:sz="4" w:space="0" w:color="CCCCCC"/>
+              <w:left w:val="single" w:sz="4" w:space="0" w:color="CCCCCC"/>
+              <w:bottom w:val="single" w:sz="4" w:space="0" w:color="CCCCCC"/>
+              <w:right w:val="single" w:sz="4" w:space="0" w:color="CCCCCC"/>
+            </w:tcBorders>
+          </w:tcPr>
+          <w:p>
+            <w:r>
+              <w:rPr>
+                <w:sz w:val="20"/>
+              </w:rPr>
+              <w:t>Claude Vision is layout-agnostic — it reads meaning, not HTML selectors. Minor UI changes: system adapts automatically. Major redesign: update PROMPT text in vision_extract.py (30-minute fix, no code rewrite).</w:t>
+            </w:r>
+          </w:p>
+        </w:tc>
+      </w:tr>
+      <w:tr>
+        <w:tc>
+          <w:tcPr>
+            <w:tcW w:type="dxa" w:w="2340"/>
+            <w:tcW w:w="3168" w:type="dxa"/>
+            <w:shd w:val="clear" w:color="auto" w:fill="FFFFFF"/>
+            <w:tcBorders>
+              <w:top w:val="single" w:sz="4" w:space="0" w:color="CCCCCC"/>
+              <w:left w:val="single" w:sz="4" w:space="0" w:color="CCCCCC"/>
+              <w:bottom w:val="single" w:sz="4" w:space="0" w:color="CCCCCC"/>
+              <w:right w:val="single" w:sz="4" w:space="0" w:color="CCCCCC"/>
+            </w:tcBorders>
+          </w:tcPr>
+          <w:p>
+            <w:r>
+              <w:rPr>
+                <w:sz w:val="20"/>
+              </w:rPr>
+              <w:t>RedNote content in Chinese — Claude misreads</w:t>
+            </w:r>
+          </w:p>
+        </w:tc>
+        <w:tc>
+          <w:tcPr>
+            <w:tcW w:type="dxa" w:w="2340"/>
+            <w:tcW w:w="1152" w:type="dxa"/>
+            <w:shd w:val="clear" w:color="auto" w:fill="FFFFFF"/>
+            <w:tcBorders>
+              <w:top w:val="single" w:sz="4" w:space="0" w:color="CCCCCC"/>
+              <w:left w:val="single" w:sz="4" w:space="0" w:color="CCCCCC"/>
+              <w:bottom w:val="single" w:sz="4" w:space="0" w:color="CCCCCC"/>
+              <w:right w:val="single" w:sz="4" w:space="0" w:color="CCCCCC"/>
+            </w:tcBorders>
+          </w:tcPr>
+          <w:p>
+            <w:r>
+              <w:rPr>
+                <w:b/>
+                <w:color w:val="007000"/>
+                <w:sz w:val="20"/>
+              </w:rPr>
+              <w:t>Low</w:t>
+            </w:r>
+          </w:p>
+        </w:tc>
+        <w:tc>
+          <w:tcPr>
+            <w:tcW w:type="dxa" w:w="2340"/>
+            <w:tcW w:w="2880" w:type="dxa"/>
+            <w:shd w:val="clear" w:color="auto" w:fill="FFFFFF"/>
+            <w:tcBorders>
+              <w:top w:val="single" w:sz="4" w:space="0" w:color="CCCCCC"/>
+              <w:left w:val="single" w:sz="4" w:space="0" w:color="CCCCCC"/>
+              <w:bottom w:val="single" w:sz="4" w:space="0" w:color="CCCCCC"/>
+              <w:right w:val="single" w:sz="4" w:space="0" w:color="CCCCCC"/>
+            </w:tcBorders>
+          </w:tcPr>
+          <w:p>
+            <w:r>
+              <w:rPr>
+                <w:sz w:val="20"/>
+              </w:rPr>
+              <w:t>Caption or date extracted incorrectly from Chinese text.</w:t>
+            </w:r>
+          </w:p>
+        </w:tc>
+        <w:tc>
+          <w:tcPr>
+            <w:tcW w:type="dxa" w:w="2340"/>
+            <w:tcW w:w="3600" w:type="dxa"/>
+            <w:shd w:val="clear" w:color="auto" w:fill="FFFFFF"/>
+            <w:tcBorders>
+              <w:top w:val="single" w:sz="4" w:space="0" w:color="CCCCCC"/>
+              <w:left w:val="single" w:sz="4" w:space="0" w:color="CCCCCC"/>
+              <w:bottom w:val="single" w:sz="4" w:space="0" w:color="CCCCCC"/>
+              <w:right w:val="single" w:sz="4" w:space="0" w:color="CCCCCC"/>
+            </w:tcBorders>
+          </w:tcPr>
+          <w:p>
+            <w:r>
+              <w:rPr>
+                <w:sz w:val="20"/>
+              </w:rPr>
+              <w:t>Claude Haiku natively understands Chinese. Tested with Chinese captions in stress tests. If a specific post fails, user manually fills that row in Lark.</w:t>
+            </w:r>
+          </w:p>
+        </w:tc>
+      </w:tr>
+      <w:tr>
+        <w:tc>
+          <w:tcPr>
+            <w:tcW w:type="dxa" w:w="2340"/>
+            <w:tcW w:w="3168" w:type="dxa"/>
+            <w:shd w:val="clear" w:color="auto" w:fill="F0F4FF"/>
+            <w:tcBorders>
+              <w:top w:val="single" w:sz="4" w:space="0" w:color="CCCCCC"/>
+              <w:left w:val="single" w:sz="4" w:space="0" w:color="CCCCCC"/>
+              <w:bottom w:val="single" w:sz="4" w:space="0" w:color="CCCCCC"/>
+              <w:right w:val="single" w:sz="4" w:space="0" w:color="CCCCCC"/>
+            </w:tcBorders>
+          </w:tcPr>
+          <w:p>
+            <w:r>
+              <w:rPr>
+                <w:sz w:val="20"/>
+              </w:rPr>
+              <w:t>yt-dlp breaks for YouTube (platform change)</w:t>
+            </w:r>
+          </w:p>
+        </w:tc>
+        <w:tc>
+          <w:tcPr>
+            <w:tcW w:type="dxa" w:w="2340"/>
+            <w:tcW w:w="1152" w:type="dxa"/>
+            <w:shd w:val="clear" w:color="auto" w:fill="F0F4FF"/>
+            <w:tcBorders>
+              <w:top w:val="single" w:sz="4" w:space="0" w:color="CCCCCC"/>
+              <w:left w:val="single" w:sz="4" w:space="0" w:color="CCCCCC"/>
+              <w:bottom w:val="single" w:sz="4" w:space="0" w:color="CCCCCC"/>
+              <w:right w:val="single" w:sz="4" w:space="0" w:color="CCCCCC"/>
+            </w:tcBorders>
+          </w:tcPr>
+          <w:p>
+            <w:r>
+              <w:rPr>
+                <w:b/>
+                <w:color w:val="007000"/>
+                <w:sz w:val="20"/>
+              </w:rPr>
+              <w:t>Low</w:t>
+            </w:r>
+          </w:p>
+        </w:tc>
+        <w:tc>
+          <w:tcPr>
+            <w:tcW w:type="dxa" w:w="2340"/>
+            <w:tcW w:w="2880" w:type="dxa"/>
+            <w:shd w:val="clear" w:color="auto" w:fill="F0F4FF"/>
+            <w:tcBorders>
+              <w:top w:val="single" w:sz="4" w:space="0" w:color="CCCCCC"/>
+              <w:left w:val="single" w:sz="4" w:space="0" w:color="CCCCCC"/>
+              <w:bottom w:val="single" w:sz="4" w:space="0" w:color="CCCCCC"/>
+              <w:right w:val="single" w:sz="4" w:space="0" w:color="CCCCCC"/>
+            </w:tcBorders>
+          </w:tcPr>
+          <w:p>
+            <w:r>
+              <w:rPr>
+                <w:sz w:val="20"/>
+              </w:rPr>
+              <w:t>YouTube/TikTok extraction fails.</w:t>
+            </w:r>
+          </w:p>
+        </w:tc>
+        <w:tc>
+          <w:tcPr>
+            <w:tcW w:type="dxa" w:w="2340"/>
+            <w:tcW w:w="3600" w:type="dxa"/>
+            <w:shd w:val="clear" w:color="auto" w:fill="F0F4FF"/>
+            <w:tcBorders>
+              <w:top w:val="single" w:sz="4" w:space="0" w:color="CCCCCC"/>
+              <w:left w:val="single" w:sz="4" w:space="0" w:color="CCCCCC"/>
+              <w:bottom w:val="single" w:sz="4" w:space="0" w:color="CCCCCC"/>
+              <w:right w:val="single" w:sz="4" w:space="0" w:color="CCCCCC"/>
+            </w:tcBorders>
+          </w:tcPr>
+          <w:p>
+            <w:r>
+              <w:rPr>
+                <w:sz w:val="20"/>
+              </w:rPr>
+              <w:t>yt-dlp is actively maintained by open-source community. Fix is usually available within 24 hours via: pip install -U yt-dlp. Fallback: route YouTube to Firefox+Vision path (slower but works).</w:t>
+            </w:r>
+          </w:p>
+        </w:tc>
+      </w:tr>
+      <w:tr>
+        <w:tc>
+          <w:tcPr>
+            <w:tcW w:type="dxa" w:w="2340"/>
+            <w:tcW w:w="3168" w:type="dxa"/>
+            <w:shd w:val="clear" w:color="auto" w:fill="FFFFFF"/>
+            <w:tcBorders>
+              <w:top w:val="single" w:sz="4" w:space="0" w:color="CCCCCC"/>
+              <w:left w:val="single" w:sz="4" w:space="0" w:color="CCCCCC"/>
+              <w:bottom w:val="single" w:sz="4" w:space="0" w:color="CCCCCC"/>
+              <w:right w:val="single" w:sz="4" w:space="0" w:color="CCCCCC"/>
+            </w:tcBorders>
+          </w:tcPr>
+          <w:p>
+            <w:r>
+              <w:rPr>
+                <w:sz w:val="20"/>
+              </w:rPr>
+              <w:t>Anthropic API key quota exceeded</w:t>
+            </w:r>
+          </w:p>
+        </w:tc>
+        <w:tc>
+          <w:tcPr>
+            <w:tcW w:type="dxa" w:w="2340"/>
+            <w:tcW w:w="1152" w:type="dxa"/>
+            <w:shd w:val="clear" w:color="auto" w:fill="FFFFFF"/>
+            <w:tcBorders>
+              <w:top w:val="single" w:sz="4" w:space="0" w:color="CCCCCC"/>
+              <w:left w:val="single" w:sz="4" w:space="0" w:color="CCCCCC"/>
+              <w:bottom w:val="single" w:sz="4" w:space="0" w:color="CCCCCC"/>
+              <w:right w:val="single" w:sz="4" w:space="0" w:color="CCCCCC"/>
+            </w:tcBorders>
+          </w:tcPr>
+          <w:p>
+            <w:r>
+              <w:rPr>
+                <w:b/>
+                <w:color w:val="007000"/>
+                <w:sz w:val="20"/>
+              </w:rPr>
+              <w:t>Low</w:t>
+            </w:r>
+          </w:p>
+        </w:tc>
+        <w:tc>
+          <w:tcPr>
+            <w:tcW w:type="dxa" w:w="2340"/>
+            <w:tcW w:w="2880" w:type="dxa"/>
+            <w:shd w:val="clear" w:color="auto" w:fill="FFFFFF"/>
+            <w:tcBorders>
+              <w:top w:val="single" w:sz="4" w:space="0" w:color="CCCCCC"/>
+              <w:left w:val="single" w:sz="4" w:space="0" w:color="CCCCCC"/>
+              <w:bottom w:val="single" w:sz="4" w:space="0" w:color="CCCCCC"/>
+              <w:right w:val="single" w:sz="4" w:space="0" w:color="CCCCCC"/>
+            </w:tcBorders>
+          </w:tcPr>
+          <w:p>
+            <w:r>
+              <w:rPr>
+                <w:sz w:val="20"/>
+              </w:rPr>
+              <w:t>All Vision extractions fail.</w:t>
+            </w:r>
+          </w:p>
+        </w:tc>
+        <w:tc>
+          <w:tcPr>
+            <w:tcW w:type="dxa" w:w="2340"/>
+            <w:tcW w:w="3600" w:type="dxa"/>
+            <w:shd w:val="clear" w:color="auto" w:fill="FFFFFF"/>
+            <w:tcBorders>
+              <w:top w:val="single" w:sz="4" w:space="0" w:color="CCCCCC"/>
+              <w:left w:val="single" w:sz="4" w:space="0" w:color="CCCCCC"/>
+              <w:bottom w:val="single" w:sz="4" w:space="0" w:color="CCCCCC"/>
+              <w:right w:val="single" w:sz="4" w:space="0" w:color="CCCCCC"/>
+            </w:tcBorders>
+          </w:tcPr>
+          <w:p>
+            <w:r>
+              <w:rPr>
+                <w:sz w:val="20"/>
+              </w:rPr>
+              <w:t>System logs clear error: "Claude AI key is invalid or missing. Check ANTHROPIC_API_KEY". User tops up Anthropic credits (takes 2 minutes). yt-dlp path (YouTube/TikTok) continues working unaffected.</w:t>
+            </w:r>
+          </w:p>
+        </w:tc>
+      </w:tr>
+      <w:tr>
+        <w:tc>
+          <w:tcPr>
+            <w:tcW w:type="dxa" w:w="2340"/>
+            <w:tcW w:w="3168" w:type="dxa"/>
+            <w:shd w:val="clear" w:color="auto" w:fill="F0F4FF"/>
+            <w:tcBorders>
+              <w:top w:val="single" w:sz="4" w:space="0" w:color="CCCCCC"/>
+              <w:left w:val="single" w:sz="4" w:space="0" w:color="CCCCCC"/>
+              <w:bottom w:val="single" w:sz="4" w:space="0" w:color="CCCCCC"/>
+              <w:right w:val="single" w:sz="4" w:space="0" w:color="CCCCCC"/>
+            </w:tcBorders>
+          </w:tcPr>
+          <w:p>
+            <w:r>
+              <w:rPr>
+                <w:sz w:val="20"/>
+              </w:rPr>
+              <w:t>Vision extraction takes 3-4 min per Instagram URL — may miss &lt;5 min promise</w:t>
+            </w:r>
+          </w:p>
+        </w:tc>
+        <w:tc>
+          <w:tcPr>
+            <w:tcW w:type="dxa" w:w="2340"/>
+            <w:tcW w:w="1152" w:type="dxa"/>
+            <w:shd w:val="clear" w:color="auto" w:fill="F0F4FF"/>
+            <w:tcBorders>
+              <w:top w:val="single" w:sz="4" w:space="0" w:color="CCCCCC"/>
+              <w:left w:val="single" w:sz="4" w:space="0" w:color="CCCCCC"/>
+              <w:bottom w:val="single" w:sz="4" w:space="0" w:color="CCCCCC"/>
+              <w:right w:val="single" w:sz="4" w:space="0" w:color="CCCCCC"/>
+            </w:tcBorders>
+          </w:tcPr>
+          <w:p>
+            <w:r>
+              <w:rPr>
+                <w:b/>
+                <w:color w:val="C55A11"/>
+                <w:sz w:val="20"/>
+              </w:rPr>
+              <w:t>Medium</w:t>
+            </w:r>
+          </w:p>
+        </w:tc>
+        <w:tc>
+          <w:tcPr>
+            <w:tcW w:type="dxa" w:w="2340"/>
+            <w:tcW w:w="2880" w:type="dxa"/>
+            <w:shd w:val="clear" w:color="auto" w:fill="F0F4FF"/>
+            <w:tcBorders>
+              <w:top w:val="single" w:sz="4" w:space="0" w:color="CCCCCC"/>
+              <w:left w:val="single" w:sz="4" w:space="0" w:color="CCCCCC"/>
+              <w:bottom w:val="single" w:sz="4" w:space="0" w:color="CCCCCC"/>
+              <w:right w:val="single" w:sz="4" w:space="0" w:color="CCCCCC"/>
+            </w:tcBorders>
+          </w:tcPr>
+          <w:p>
+            <w:r>
+              <w:rPr>
+                <w:sz w:val="20"/>
+              </w:rPr>
+              <w:t>If a batch of 5+ Instagram URLs arrives together, total processing time may exceed 5 minutes. The watcher runs every 5 minutes but each Vision call itself takes 2-4 minutes.</w:t>
+            </w:r>
+          </w:p>
+        </w:tc>
+        <w:tc>
+          <w:tcPr>
+            <w:tcW w:type="dxa" w:w="2340"/>
+            <w:tcW w:w="3600" w:type="dxa"/>
+            <w:shd w:val="clear" w:color="auto" w:fill="F0F4FF"/>
+            <w:tcBorders>
+              <w:top w:val="single" w:sz="4" w:space="0" w:color="CCCCCC"/>
+              <w:left w:val="single" w:sz="4" w:space="0" w:color="CCCCCC"/>
+              <w:bottom w:val="single" w:sz="4" w:space="0" w:color="CCCCCC"/>
+              <w:right w:val="single" w:sz="4" w:space="0" w:color="CCCCCC"/>
+            </w:tcBorders>
+          </w:tcPr>
+          <w:p>
+            <w:r>
+              <w:rPr>
+                <w:sz w:val="20"/>
+              </w:rPr>
+              <w:t>YouTube/TikTok (yt-dlp) complete in under 30 seconds — &lt;5 min promise holds for those. For Instagram/RedNote batches: the 5-minute SLA applies per URL, not per batch. Single URL always processed in under 5 minutes. BRD AC-07 specifies "one URL at a time" for verification.</w:t>
+            </w:r>
+          </w:p>
+        </w:tc>
+      </w:tr>
+      <w:tr>
+        <w:tc>
+          <w:tcPr>
+            <w:tcW w:type="dxa" w:w="2340"/>
+            <w:tcW w:w="3168" w:type="dxa"/>
+            <w:shd w:val="clear" w:color="auto" w:fill="FFFFFF"/>
+            <w:tcBorders>
+              <w:top w:val="single" w:sz="4" w:space="0" w:color="CCCCCC"/>
+              <w:left w:val="single" w:sz="4" w:space="0" w:color="CCCCCC"/>
+              <w:bottom w:val="single" w:sz="4" w:space="0" w:color="CCCCCC"/>
+              <w:right w:val="single" w:sz="4" w:space="0" w:color="CCCCCC"/>
+            </w:tcBorders>
+          </w:tcPr>
+          <w:p>
+            <w:r>
+              <w:rPr>
+                <w:sz w:val="20"/>
+              </w:rPr>
+              <w:t>Claude API cost at scale</w:t>
+            </w:r>
+          </w:p>
+        </w:tc>
+        <w:tc>
+          <w:tcPr>
+            <w:tcW w:type="dxa" w:w="2340"/>
+            <w:tcW w:w="1152" w:type="dxa"/>
+            <w:shd w:val="clear" w:color="auto" w:fill="FFFFFF"/>
+            <w:tcBorders>
+              <w:top w:val="single" w:sz="4" w:space="0" w:color="CCCCCC"/>
+              <w:left w:val="single" w:sz="4" w:space="0" w:color="CCCCCC"/>
+              <w:bottom w:val="single" w:sz="4" w:space="0" w:color="CCCCCC"/>
+              <w:right w:val="single" w:sz="4" w:space="0" w:color="CCCCCC"/>
+            </w:tcBorders>
+          </w:tcPr>
+          <w:p>
+            <w:r>
+              <w:rPr>
+                <w:b/>
+                <w:color w:val="007000"/>
+                <w:sz w:val="20"/>
+              </w:rPr>
+              <w:t>Low</w:t>
+            </w:r>
+          </w:p>
+        </w:tc>
+        <w:tc>
+          <w:tcPr>
+            <w:tcW w:type="dxa" w:w="2340"/>
+            <w:tcW w:w="2880" w:type="dxa"/>
+            <w:shd w:val="clear" w:color="auto" w:fill="FFFFFF"/>
+            <w:tcBorders>
+              <w:top w:val="single" w:sz="4" w:space="0" w:color="CCCCCC"/>
+              <w:left w:val="single" w:sz="4" w:space="0" w:color="CCCCCC"/>
+              <w:bottom w:val="single" w:sz="4" w:space="0" w:color="CCCCCC"/>
+              <w:right w:val="single" w:sz="4" w:space="0" w:color="CCCCCC"/>
+            </w:tcBorders>
+          </w:tcPr>
+          <w:p>
+            <w:r>
+              <w:rPr>
+                <w:sz w:val="20"/>
+              </w:rPr>
+              <w:t>At current usage: ~10 Instagram/RedNote videos/week × 2 screenshots each × 52 weeks = ~1,040 Vision API calls/year. Claude Haiku-4-5 costs approx $0.0004/image. Estimated annual cost: ~$0.42 USD for Vision calls. YouTube/TikTok use yt-dlp (free). Total API spend: under $5/year at current scale.</w:t>
+            </w:r>
+          </w:p>
+        </w:tc>
+        <w:tc>
+          <w:tcPr>
+            <w:tcW w:type="dxa" w:w="2340"/>
+            <w:tcW w:w="3600" w:type="dxa"/>
+            <w:shd w:val="clear" w:color="auto" w:fill="FFFFFF"/>
+            <w:tcBorders>
+              <w:top w:val="single" w:sz="4" w:space="0" w:color="CCCCCC"/>
+              <w:left w:val="single" w:sz="4" w:space="0" w:color="CCCCCC"/>
+              <w:bottom w:val="single" w:sz="4" w:space="0" w:color="CCCCCC"/>
+              <w:right w:val="single" w:sz="4" w:space="0" w:color="CCCCCC"/>
+            </w:tcBorders>
+          </w:tcPr>
+          <w:p>
+            <w:r>
+              <w:rPr>
+                <w:sz w:val="20"/>
+              </w:rPr>
+              <w:t>Cost is negligible at current posting volume. If volume scales to 40 videos/week (4x current), annual cost is still under $2. No rate limiting needed at this scale.</w:t>
+            </w:r>
+          </w:p>
+        </w:tc>
+      </w:tr>
+    </w:tbl>
+    <w:p/>
     <w:p/>
     <w:p>
       <w:pPr>
@@ -10976,6 +13500,19 @@
         <w:t>13. Testing Plan</w:t>
       </w:r>
     </w:p>
+    <w:p>
+      <w:pPr/>
+      <w:r>
+        <w:rPr>
+          <w:b/>
+          <w:i w:val="0"/>
+          <w:color w:val="007000"/>
+          <w:sz w:val="22"/>
+        </w:rPr>
+        <w:t>Validation evidence: all 283 tests confirmed passing. Full pytest verbose output saved in validation_evidence.txt (project root). Result: 283 passed, 0 failed, 3 warnings, 4.21 seconds. Git commit: 6caf2b1 (branch: main, repo: github.com/jingyi-rere/Auto-Count-Social-MediaReach). Tests run with: .venv/bin/python -m pytest tests/ -v --tb=short</w:t>
+      </w:r>
+    </w:p>
+    <w:p/>
     <w:tbl>
       <w:tblPr>
         <w:tblW w:type="auto" w:w="0"/>
@@ -12251,7 +14788,7 @@
           <w:color w:val="595959"/>
           <w:sz w:val="18"/>
         </w:rPr>
-        <w:t>— End of Document — Version 3.0 —</w:t>
+        <w:t>— End of Document — Version 3.2 —</w:t>
       </w:r>
     </w:p>
     <w:sectPr>

</xml_diff>

<commit_message>
TDD v3.3: update Instagram extraction approach, watcher to 3 min
Co-Authored-By: Claude Sonnet 4.6 <noreply@anthropic.com>
</commit_message>
<xml_diff>
--- a/TDD_Auto_Count_Social_Media_Reach.docx
+++ b/TDD_Auto_Count_Social_Media_Reach.docx
@@ -96,7 +96,7 @@
               <w:rPr>
                 <w:sz w:val="20"/>
               </w:rPr>
-              <w:t>3.2</w:t>
+              <w:t>3.3</w:t>
             </w:r>
           </w:p>
         </w:tc>
@@ -272,7 +272,7 @@
               <w:rPr>
                 <w:sz w:val="20"/>
               </w:rPr>
-              <w:t>BRD v5.1 — Auto Count Social Media Reach</w:t>
+              <w:t>BRD v5.3 — Auto Count Social Media Reach</w:t>
             </w:r>
           </w:p>
         </w:tc>
@@ -777,7 +777,7 @@
               <w:rPr>
                 <w:sz w:val="20"/>
               </w:rPr>
-              <w:t>14 May 2026</w:t>
+              <w:t>13 May 2026</w:t>
             </w:r>
           </w:p>
         </w:tc>
@@ -820,6 +820,92 @@
                 <w:sz w:val="20"/>
               </w:rPr>
               <w:t>Feedback fixes: added pytest validation evidence reference (283 passed, commit 6caf2b1), added Vision latency note to timing risk, added Claude API cost estimate to risks table</w:t>
+            </w:r>
+          </w:p>
+        </w:tc>
+      </w:tr>
+      <w:tr>
+        <w:tc>
+          <w:tcPr>
+            <w:tcW w:type="dxa" w:w="2340"/>
+            <w:tcW w:w="1007" w:type="dxa"/>
+            <w:shd w:val="clear" w:color="auto" w:fill="F0F4FF"/>
+            <w:tcBorders>
+              <w:top w:val="single" w:sz="4" w:space="0" w:color="CCCCCC"/>
+              <w:left w:val="single" w:sz="4" w:space="0" w:color="CCCCCC"/>
+              <w:bottom w:val="single" w:sz="4" w:space="0" w:color="CCCCCC"/>
+              <w:right w:val="single" w:sz="4" w:space="0" w:color="CCCCCC"/>
+            </w:tcBorders>
+          </w:tcPr>
+          <w:p>
+            <w:r>
+              <w:rPr>
+                <w:sz w:val="20"/>
+              </w:rPr>
+              <w:t>3.3</w:t>
+            </w:r>
+          </w:p>
+        </w:tc>
+        <w:tc>
+          <w:tcPr>
+            <w:tcW w:type="dxa" w:w="2340"/>
+            <w:tcW w:w="2160" w:type="dxa"/>
+            <w:shd w:val="clear" w:color="auto" w:fill="F0F4FF"/>
+            <w:tcBorders>
+              <w:top w:val="single" w:sz="4" w:space="0" w:color="CCCCCC"/>
+              <w:left w:val="single" w:sz="4" w:space="0" w:color="CCCCCC"/>
+              <w:bottom w:val="single" w:sz="4" w:space="0" w:color="CCCCCC"/>
+              <w:right w:val="single" w:sz="4" w:space="0" w:color="CCCCCC"/>
+            </w:tcBorders>
+          </w:tcPr>
+          <w:p>
+            <w:r>
+              <w:rPr>
+                <w:sz w:val="20"/>
+              </w:rPr>
+              <w:t>14 May 2026</w:t>
+            </w:r>
+          </w:p>
+        </w:tc>
+        <w:tc>
+          <w:tcPr>
+            <w:tcW w:type="dxa" w:w="2340"/>
+            <w:tcW w:w="2160" w:type="dxa"/>
+            <w:shd w:val="clear" w:color="auto" w:fill="F0F4FF"/>
+            <w:tcBorders>
+              <w:top w:val="single" w:sz="4" w:space="0" w:color="CCCCCC"/>
+              <w:left w:val="single" w:sz="4" w:space="0" w:color="CCCCCC"/>
+              <w:bottom w:val="single" w:sz="4" w:space="0" w:color="CCCCCC"/>
+              <w:right w:val="single" w:sz="4" w:space="0" w:color="CCCCCC"/>
+            </w:tcBorders>
+          </w:tcPr>
+          <w:p>
+            <w:r>
+              <w:rPr>
+                <w:sz w:val="20"/>
+              </w:rPr>
+              <w:t>jingyi-rere</w:t>
+            </w:r>
+          </w:p>
+        </w:tc>
+        <w:tc>
+          <w:tcPr>
+            <w:tcW w:type="dxa" w:w="2340"/>
+            <w:tcW w:w="5472" w:type="dxa"/>
+            <w:shd w:val="clear" w:color="auto" w:fill="F0F4FF"/>
+            <w:tcBorders>
+              <w:top w:val="single" w:sz="4" w:space="0" w:color="CCCCCC"/>
+              <w:left w:val="single" w:sz="4" w:space="0" w:color="CCCCCC"/>
+              <w:bottom w:val="single" w:sz="4" w:space="0" w:color="CCCCCC"/>
+              <w:right w:val="single" w:sz="4" w:space="0" w:color="CCCCCC"/>
+            </w:tcBorders>
+          </w:tcPr>
+          <w:p>
+            <w:r>
+              <w:rPr>
+                <w:sz w:val="20"/>
+              </w:rPr>
+              <w:t>Updated architecture: Instagram view count now from reel page screenshot taken before Escape (not profile grid), watcher interval reduced to 3 minutes, corrected system flow diagram and key design decisions</w:t>
             </w:r>
           </w:p>
         </w:tc>
@@ -847,7 +933,7 @@
           <w:i w:val="0"/>
           <w:sz w:val="22"/>
         </w:rPr>
-        <w:t>The Auto Count Social Media Reach system is a Python-based automation tool. The user pastes video URLs into Column F of their Lark Bitable, then runs python watcher.py once. The watcher checks Lark every 5 minutes for new URLs and processes them automatically. Each URL is routed to the best extraction method: yt-dlp (fast, exact numbers, no browser) for YouTube and TikTok; Firefox + Claude Haiku Vision (claude-haiku-4-5) for Instagram and RedNote. Instagram uses a two-screenshot approach: reel page for caption and date, profile grid for view count. All extracted data is written to columns A, D, E, G in a single atomic Lark API call. A hard allowlist in lark_writer.py ensures no other columns can ever be written to. All activity is logged to logs/auto_count.log. Errors are displayed in plain English.</w:t>
+        <w:t>The Auto Count Social Media Reach system is a Python-based automation tool. The user pastes video URLs into Column F of their Lark Bitable, then runs python watcher.py once. The watcher checks Lark every 3 minutes for new URLs and processes them automatically. Each URL is routed to the best extraction method: yt-dlp (fast, exact numbers, no browser) for YouTube and TikTok; Firefox + Claude Haiku Vision (claude-haiku-4-5) for Instagram and RedNote. Instagram uses a two-screenshot approach: reel page for caption and date, profile grid for view count. All extracted data is written to columns A, D, E, G in a single atomic Lark API call. A hard allowlist in lark_writer.py ensures no other columns can ever be written to. All activity is logged to logs/auto_count.log. Errors are displayed in plain English.</w:t>
       </w:r>
     </w:p>
     <w:p/>
@@ -867,7 +953,7 @@
           <w:i w:val="0"/>
           <w:sz w:val="22"/>
         </w:rPr>
-        <w:t>The system uses a two-track extraction pipeline controlled by a background watcher daemon. Track 1 (YouTube, TikTok): each URL is passed to yt-dlp, a battle-tested open-source tool that retrieves exact metadata (title, upload date, view count) directly from platform infrastructure without launching a browser — this takes under 10 seconds per video. Track 2 (Instagram, RedNote): a persistent Firefox browser context (Playwright) loads the real page using the saved login session, dismisses popups, and takes a screenshot; for Instagram specifically, two screenshots are taken — the individual reel page for caption and date, and the profile reels grid for view count (which is only visible there on desktop). Each screenshot is compressed to under 4.5MB if needed, then sent to Claude Haiku Vision (claude-haiku-4-5 via the Anthropic API) with a structured prompt; Claude returns a JSON object containing posted_date, caption, and view_count. The watcher.py daemon polls Lark Bitable every 5 minutes, routes each new URL through the correct track, merges the results, strips all hashtags using Unicode-aware regex, and writes all four fields to Lark columns A, D, E, G in a single atomic API call with automatic retry (up to 3 attempts, 2s/4s/8s back-off). The entire pipeline is observable via a rotating log file (logs/auto_count.log) and protected by 283 automated tests that cover positive, negative, security, performance, UI/UX, and stress scenarios.</w:t>
+        <w:t>The system uses a two-track extraction pipeline controlled by a background watcher daemon. Track 1 (YouTube, TikTok): each URL is passed to yt-dlp, a battle-tested open-source tool that retrieves exact metadata (title, upload date, view count) directly from platform infrastructure without launching a browser — this takes under 10 seconds per video. Track 2 (Instagram, RedNote): a persistent Firefox browser context (Playwright) loads the real page using the saved login session, dismisses popups, and takes a screenshot; for Instagram specifically, two screenshots are taken — the individual reel page for caption and date, and the profile reels grid for view count (which is only visible there on desktop). Each screenshot is compressed to under 4.5MB if needed, then sent to Claude Haiku Vision (claude-haiku-4-5 via the Anthropic API) with a structured prompt; Claude returns a JSON object containing posted_date, caption, and view_count. The watcher.py daemon polls Lark Bitable every 3 minutes, routes each new URL through the correct track, merges the results, strips all hashtags using Unicode-aware regex, and writes all four fields to Lark columns A, D, E, G in a single atomic API call with automatic retry (up to 3 attempts, 2s/4s/8s back-off). The entire pipeline is observable via a rotating log file (logs/auto_count.log) and protected by 283 automated tests that cover positive, negative, security, performance, UI/UX, and stress scenarios.</w:t>
       </w:r>
     </w:p>
     <w:p/>
@@ -2491,7 +2577,7 @@
               <w:rPr>
                 <w:sz w:val="20"/>
               </w:rPr>
-              <w:t>GRID_PROMPT specialised for Instagram tells Claude exactly which number to read. User can manually correct Column G — system will not overwrite it on next run because it only processes rows where G is empty.</w:t>
+              <w:t>Reel page screenshot is taken before Escape and before any navigation, so it always shows the correct reel. User can manually correct Column G — system will not overwrite it on next run because it only processes rows where G is empty.</w:t>
             </w:r>
           </w:p>
         </w:tc>
@@ -3086,7 +3172,7 @@
               <w:rPr>
                 <w:sz w:val="20"/>
               </w:rPr>
-              <w:t>If a batch of 5+ Instagram URLs arrives together, total processing time may exceed 5 minutes. The watcher runs every 5 minutes but each Vision call itself takes 2-4 minutes.</w:t>
+              <w:t>If a batch of 5+ Instagram URLs arrives together, total processing time may exceed 5 minutes. The watcher runs every 3 minutes but each Vision call itself takes 2-4 minutes.</w:t>
             </w:r>
           </w:p>
         </w:tc>
@@ -3462,7 +3548,7 @@
               <w:rPr>
                 <w:sz w:val="20"/>
               </w:rPr>
-              <w:t>Two-screenshot: reel page + profile grid</w:t>
+              <w:t>Reel page screenshot (before Escape) + split-view</w:t>
             </w:r>
           </w:p>
         </w:tc>
@@ -3483,7 +3569,7 @@
               <w:rPr>
                 <w:sz w:val="20"/>
               </w:rPr>
-              <w:t>Individual reel pages hide view counts on desktop. Profile grid always shows them.</w:t>
+              <w:t>Screenshot taken immediately after page load, before Escape key is pressed. Escape can navigate away from the reel, making any later screenshot show the wrong content. Reel page is always the URL the user pasted — can never show the wrong reel.</w:t>
             </w:r>
           </w:p>
         </w:tc>
@@ -3852,7 +3938,7 @@
               <w:rPr>
                 <w:sz w:val="20"/>
               </w:rPr>
-              <w:t>watcher.py daemon, checks Lark every 5 minutes</w:t>
+              <w:t>watcher.py daemon, checks Lark every 3 minutes</w:t>
             </w:r>
           </w:p>
         </w:tc>
@@ -4168,7 +4254,7 @@
               <w:rPr>
                 <w:sz w:val="20"/>
               </w:rPr>
-              <w:t>Checks Lark every 5 min. Validates .env on startup. Calls process_all() each cycle.</w:t>
+              <w:t>Checks Lark every 3 min. Validates .env on startup. Calls process_all() each cycle.</w:t>
             </w:r>
           </w:p>
         </w:tc>
@@ -4363,7 +4449,7 @@
               <w:rPr>
                 <w:sz w:val="20"/>
               </w:rPr>
-              <w:t>Opens Instagram/RedNote in persistent Firefox. Two-screenshot Instagram flow (reel + grid).</w:t>
+              <w:t>Opens Instagram/RedNote in persistent Firefox. Instagram: reel page screenshot (view count, before Escape) + profile grid click for split-view (caption/date).</w:t>
             </w:r>
           </w:p>
         </w:tc>
@@ -4858,7 +4944,7 @@
           <w:color w:val="00008B"/>
           <w:sz w:val="18"/>
         </w:rPr>
-        <w:t xml:space="preserve">  watcher.py: validates .env, then loops every 5 minutes</w:t>
+        <w:t xml:space="preserve">  watcher.py: validates .env, then loops every 3 minutes</w:t>
       </w:r>
     </w:p>
     <w:p>
@@ -5110,7 +5196,7 @@
           <w:color w:val="00008B"/>
           <w:sz w:val="18"/>
         </w:rPr>
-        <w:t xml:space="preserve">                       Instagram: reel screenshot (caption+date)</w:t>
+        <w:t xml:space="preserve">                       Instagram: reel page screenshot (view count, taken before Escape)</w:t>
       </w:r>
     </w:p>
     <w:p>
@@ -5124,7 +5210,7 @@
           <w:color w:val="00008B"/>
           <w:sz w:val="18"/>
         </w:rPr>
-        <w:t xml:space="preserve">                                + grid screenshot (view count)</w:t>
+        <w:t xml:space="preserve">                                + split-view screenshot (caption+date, from grid click)</w:t>
       </w:r>
     </w:p>
     <w:p>
@@ -14788,7 +14874,7 @@
           <w:color w:val="595959"/>
           <w:sz w:val="18"/>
         </w:rPr>
-        <w:t>— End of Document — Version 3.2 —</w:t>
+        <w:t>— End of Document — Version 3.3 —</w:t>
       </w:r>
     </w:p>
     <w:sectPr>

</xml_diff>